<commit_message>
Complete manuscript tables and captions
</commit_message>
<xml_diff>
--- a/deliverables/conference_submission_draft/conference_manuscript_with_figures.docx
+++ b/deliverables/conference_submission_draft/conference_manuscript_with_figures.docx
@@ -444,31 +444,19 @@
         <w:t xml:space="preserve"> </w:t>
       </w:r>
       <w:r>
-        <w:t xml:space="preserve">File stem:</w:t>
-      </w:r>
-      <w:r>
-        <w:t xml:space="preserve"> </w:t>
-      </w:r>
-      <w:r>
-        <w:rPr>
-          <w:rStyle w:val="VerbatimChar"/>
-        </w:rPr>
-        <w:t xml:space="preserve">figures/conference/figure1_evidence_chain</w:t>
-      </w:r>
-      <w:r>
-        <w:t xml:space="preserve">. The schematic shows the study logic:</w:t>
-      </w:r>
-      <w:r>
-        <w:t xml:space="preserve"> </w:t>
-      </w:r>
-      <w:r>
-        <w:t xml:space="preserve">identical images, faithful C0 outputs, C1-C4 false-colour prompts, paired flip</w:t>
-      </w:r>
-      <w:r>
-        <w:t xml:space="preserve"> </w:t>
-      </w:r>
-      <w:r>
-        <w:t xml:space="preserve">definition, and boundary diagnostics.</w:t>
+        <w:t xml:space="preserve">The schematic</w:t>
+      </w:r>
+      <w:r>
+        <w:t xml:space="preserve"> </w:t>
+      </w:r>
+      <w:r>
+        <w:t xml:space="preserve">shows the study logic: identical images, faithful C0 outputs, C1-C4 false-colour</w:t>
+      </w:r>
+      <w:r>
+        <w:t xml:space="preserve"> </w:t>
+      </w:r>
+      <w:r>
+        <w:t xml:space="preserve">prompts, paired flip definition, and boundary diagnostics.</w:t>
       </w:r>
     </w:p>
     <w:bookmarkEnd w:id="13"/>
@@ -774,33 +762,425 @@
         <w:t xml:space="preserve"> </w:t>
       </w:r>
       <w:r>
-        <w:t xml:space="preserve">Source file:</w:t>
-      </w:r>
-      <w:r>
-        <w:t xml:space="preserve"> </w:t>
-      </w:r>
-      <w:r>
-        <w:rPr>
-          <w:rStyle w:val="VerbatimChar"/>
-        </w:rPr>
-        <w:t xml:space="preserve">data/metadata/balanced_eval_set/balanced_eval_set_summary.json</w:t>
-      </w:r>
-      <w:r>
-        <w:t xml:space="preserve">. The table should</w:t>
-      </w:r>
-      <w:r>
-        <w:t xml:space="preserve"> </w:t>
-      </w:r>
-      <w:r>
-        <w:t xml:space="preserve">report the six true-colour classes, 50 images per class, and the StanfordCars/VCoR</w:t>
-      </w:r>
-      <w:r>
-        <w:t xml:space="preserve"> </w:t>
-      </w:r>
-      <w:r>
-        <w:t xml:space="preserve">source counts.</w:t>
-      </w:r>
-    </w:p>
+        <w:t xml:space="preserve">The main evaluation set contains 300 images balanced across six true colours. Source identity is retained for provenance and sanity checks, not as a primary comparison axis.</w:t>
+      </w:r>
+    </w:p>
+    <w:tbl>
+      <w:tblPr>
+        <w:tblStyle w:val="Table"/>
+        <w:tblW w:type="auto" w:w="0"/>
+        <w:tblLook w:firstRow="1" w:lastRow="0" w:firstColumn="0" w:lastColumn="0" w:noHBand="0" w:noVBand="0" w:val="0020"/>
+      </w:tblPr>
+      <w:tblGrid>
+        <w:gridCol w:w="1980"/>
+        <w:gridCol w:w="1980"/>
+        <w:gridCol w:w="1980"/>
+        <w:gridCol w:w="1980"/>
+      </w:tblGrid>
+      <w:tr>
+        <w:trPr>
+          <w:tblHeader w:val="on"/>
+        </w:trPr>
+        <w:tc>
+          <w:tcPr/>
+          <w:p>
+            <w:pPr>
+              <w:pStyle w:val="Compact"/>
+              <w:jc w:val="left"/>
+            </w:pPr>
+            <w:r>
+              <w:t xml:space="preserve">True colour</w:t>
+            </w:r>
+          </w:p>
+        </w:tc>
+        <w:tc>
+          <w:tcPr/>
+          <w:p>
+            <w:pPr>
+              <w:pStyle w:val="Compact"/>
+              <w:jc w:val="right"/>
+            </w:pPr>
+            <w:r>
+              <w:t xml:space="preserve">StanfordCars</w:t>
+            </w:r>
+          </w:p>
+        </w:tc>
+        <w:tc>
+          <w:tcPr/>
+          <w:p>
+            <w:pPr>
+              <w:pStyle w:val="Compact"/>
+              <w:jc w:val="right"/>
+            </w:pPr>
+            <w:r>
+              <w:t xml:space="preserve">VCoR</w:t>
+            </w:r>
+          </w:p>
+        </w:tc>
+        <w:tc>
+          <w:tcPr/>
+          <w:p>
+            <w:pPr>
+              <w:pStyle w:val="Compact"/>
+              <w:jc w:val="right"/>
+            </w:pPr>
+            <w:r>
+              <w:t xml:space="preserve">Total</w:t>
+            </w:r>
+          </w:p>
+        </w:tc>
+      </w:tr>
+      <w:tr>
+        <w:tc>
+          <w:tcPr/>
+          <w:p>
+            <w:pPr>
+              <w:pStyle w:val="Compact"/>
+              <w:jc w:val="left"/>
+            </w:pPr>
+            <w:r>
+              <w:t xml:space="preserve">black</w:t>
+            </w:r>
+          </w:p>
+        </w:tc>
+        <w:tc>
+          <w:tcPr/>
+          <w:p>
+            <w:pPr>
+              <w:pStyle w:val="Compact"/>
+              <w:jc w:val="right"/>
+            </w:pPr>
+            <w:r>
+              <w:t xml:space="preserve">23</w:t>
+            </w:r>
+          </w:p>
+        </w:tc>
+        <w:tc>
+          <w:tcPr/>
+          <w:p>
+            <w:pPr>
+              <w:pStyle w:val="Compact"/>
+              <w:jc w:val="right"/>
+            </w:pPr>
+            <w:r>
+              <w:t xml:space="preserve">27</w:t>
+            </w:r>
+          </w:p>
+        </w:tc>
+        <w:tc>
+          <w:tcPr/>
+          <w:p>
+            <w:pPr>
+              <w:pStyle w:val="Compact"/>
+              <w:jc w:val="right"/>
+            </w:pPr>
+            <w:r>
+              <w:t xml:space="preserve">50</w:t>
+            </w:r>
+          </w:p>
+        </w:tc>
+      </w:tr>
+      <w:tr>
+        <w:tc>
+          <w:tcPr/>
+          <w:p>
+            <w:pPr>
+              <w:pStyle w:val="Compact"/>
+              <w:jc w:val="left"/>
+            </w:pPr>
+            <w:r>
+              <w:t xml:space="preserve">blue</w:t>
+            </w:r>
+          </w:p>
+        </w:tc>
+        <w:tc>
+          <w:tcPr/>
+          <w:p>
+            <w:pPr>
+              <w:pStyle w:val="Compact"/>
+              <w:jc w:val="right"/>
+            </w:pPr>
+            <w:r>
+              <w:t xml:space="preserve">12</w:t>
+            </w:r>
+          </w:p>
+        </w:tc>
+        <w:tc>
+          <w:tcPr/>
+          <w:p>
+            <w:pPr>
+              <w:pStyle w:val="Compact"/>
+              <w:jc w:val="right"/>
+            </w:pPr>
+            <w:r>
+              <w:t xml:space="preserve">38</w:t>
+            </w:r>
+          </w:p>
+        </w:tc>
+        <w:tc>
+          <w:tcPr/>
+          <w:p>
+            <w:pPr>
+              <w:pStyle w:val="Compact"/>
+              <w:jc w:val="right"/>
+            </w:pPr>
+            <w:r>
+              <w:t xml:space="preserve">50</w:t>
+            </w:r>
+          </w:p>
+        </w:tc>
+      </w:tr>
+      <w:tr>
+        <w:tc>
+          <w:tcPr/>
+          <w:p>
+            <w:pPr>
+              <w:pStyle w:val="Compact"/>
+              <w:jc w:val="left"/>
+            </w:pPr>
+            <w:r>
+              <w:t xml:space="preserve">green</w:t>
+            </w:r>
+          </w:p>
+        </w:tc>
+        <w:tc>
+          <w:tcPr/>
+          <w:p>
+            <w:pPr>
+              <w:pStyle w:val="Compact"/>
+              <w:jc w:val="right"/>
+            </w:pPr>
+            <w:r>
+              <w:t xml:space="preserve">2</w:t>
+            </w:r>
+          </w:p>
+        </w:tc>
+        <w:tc>
+          <w:tcPr/>
+          <w:p>
+            <w:pPr>
+              <w:pStyle w:val="Compact"/>
+              <w:jc w:val="right"/>
+            </w:pPr>
+            <w:r>
+              <w:t xml:space="preserve">48</w:t>
+            </w:r>
+          </w:p>
+        </w:tc>
+        <w:tc>
+          <w:tcPr/>
+          <w:p>
+            <w:pPr>
+              <w:pStyle w:val="Compact"/>
+              <w:jc w:val="right"/>
+            </w:pPr>
+            <w:r>
+              <w:t xml:space="preserve">50</w:t>
+            </w:r>
+          </w:p>
+        </w:tc>
+      </w:tr>
+      <w:tr>
+        <w:tc>
+          <w:tcPr/>
+          <w:p>
+            <w:pPr>
+              <w:pStyle w:val="Compact"/>
+              <w:jc w:val="left"/>
+            </w:pPr>
+            <w:r>
+              <w:t xml:space="preserve">red</w:t>
+            </w:r>
+          </w:p>
+        </w:tc>
+        <w:tc>
+          <w:tcPr/>
+          <w:p>
+            <w:pPr>
+              <w:pStyle w:val="Compact"/>
+              <w:jc w:val="right"/>
+            </w:pPr>
+            <w:r>
+              <w:t xml:space="preserve">40</w:t>
+            </w:r>
+          </w:p>
+        </w:tc>
+        <w:tc>
+          <w:tcPr/>
+          <w:p>
+            <w:pPr>
+              <w:pStyle w:val="Compact"/>
+              <w:jc w:val="right"/>
+            </w:pPr>
+            <w:r>
+              <w:t xml:space="preserve">10</w:t>
+            </w:r>
+          </w:p>
+        </w:tc>
+        <w:tc>
+          <w:tcPr/>
+          <w:p>
+            <w:pPr>
+              <w:pStyle w:val="Compact"/>
+              <w:jc w:val="right"/>
+            </w:pPr>
+            <w:r>
+              <w:t xml:space="preserve">50</w:t>
+            </w:r>
+          </w:p>
+        </w:tc>
+      </w:tr>
+      <w:tr>
+        <w:tc>
+          <w:tcPr/>
+          <w:p>
+            <w:pPr>
+              <w:pStyle w:val="Compact"/>
+              <w:jc w:val="left"/>
+            </w:pPr>
+            <w:r>
+              <w:t xml:space="preserve">white</w:t>
+            </w:r>
+          </w:p>
+        </w:tc>
+        <w:tc>
+          <w:tcPr/>
+          <w:p>
+            <w:pPr>
+              <w:pStyle w:val="Compact"/>
+              <w:jc w:val="right"/>
+            </w:pPr>
+            <w:r>
+              <w:t xml:space="preserve">14</w:t>
+            </w:r>
+          </w:p>
+        </w:tc>
+        <w:tc>
+          <w:tcPr/>
+          <w:p>
+            <w:pPr>
+              <w:pStyle w:val="Compact"/>
+              <w:jc w:val="right"/>
+            </w:pPr>
+            <w:r>
+              <w:t xml:space="preserve">36</w:t>
+            </w:r>
+          </w:p>
+        </w:tc>
+        <w:tc>
+          <w:tcPr/>
+          <w:p>
+            <w:pPr>
+              <w:pStyle w:val="Compact"/>
+              <w:jc w:val="right"/>
+            </w:pPr>
+            <w:r>
+              <w:t xml:space="preserve">50</w:t>
+            </w:r>
+          </w:p>
+        </w:tc>
+      </w:tr>
+      <w:tr>
+        <w:tc>
+          <w:tcPr/>
+          <w:p>
+            <w:pPr>
+              <w:pStyle w:val="Compact"/>
+              <w:jc w:val="left"/>
+            </w:pPr>
+            <w:r>
+              <w:t xml:space="preserve">yellow</w:t>
+            </w:r>
+          </w:p>
+        </w:tc>
+        <w:tc>
+          <w:tcPr/>
+          <w:p>
+            <w:pPr>
+              <w:pStyle w:val="Compact"/>
+              <w:jc w:val="right"/>
+            </w:pPr>
+            <w:r>
+              <w:t xml:space="preserve">2</w:t>
+            </w:r>
+          </w:p>
+        </w:tc>
+        <w:tc>
+          <w:tcPr/>
+          <w:p>
+            <w:pPr>
+              <w:pStyle w:val="Compact"/>
+              <w:jc w:val="right"/>
+            </w:pPr>
+            <w:r>
+              <w:t xml:space="preserve">48</w:t>
+            </w:r>
+          </w:p>
+        </w:tc>
+        <w:tc>
+          <w:tcPr/>
+          <w:p>
+            <w:pPr>
+              <w:pStyle w:val="Compact"/>
+              <w:jc w:val="right"/>
+            </w:pPr>
+            <w:r>
+              <w:t xml:space="preserve">50</w:t>
+            </w:r>
+          </w:p>
+        </w:tc>
+      </w:tr>
+      <w:tr>
+        <w:tc>
+          <w:tcPr/>
+          <w:p>
+            <w:pPr>
+              <w:pStyle w:val="Compact"/>
+              <w:jc w:val="left"/>
+            </w:pPr>
+            <w:r>
+              <w:t xml:space="preserve">Total</w:t>
+            </w:r>
+          </w:p>
+        </w:tc>
+        <w:tc>
+          <w:tcPr/>
+          <w:p>
+            <w:pPr>
+              <w:pStyle w:val="Compact"/>
+              <w:jc w:val="right"/>
+            </w:pPr>
+            <w:r>
+              <w:t xml:space="preserve">93</w:t>
+            </w:r>
+          </w:p>
+        </w:tc>
+        <w:tc>
+          <w:tcPr/>
+          <w:p>
+            <w:pPr>
+              <w:pStyle w:val="Compact"/>
+              <w:jc w:val="right"/>
+            </w:pPr>
+            <w:r>
+              <w:t xml:space="preserve">207</w:t>
+            </w:r>
+          </w:p>
+        </w:tc>
+        <w:tc>
+          <w:tcPr/>
+          <w:p>
+            <w:pPr>
+              <w:pStyle w:val="Compact"/>
+              <w:jc w:val="right"/>
+            </w:pPr>
+            <w:r>
+              <w:t xml:space="preserve">300</w:t>
+            </w:r>
+          </w:p>
+        </w:tc>
+      </w:tr>
+    </w:tbl>
     <w:bookmarkEnd w:id="19"/>
     <w:bookmarkStart w:id="20" w:name="models"/>
     <w:p>
@@ -894,71 +1274,326 @@
         <w:t xml:space="preserve"> </w:t>
       </w:r>
       <w:r>
-        <w:t xml:space="preserve">This table should summarise C0-C4 without</w:t>
-      </w:r>
-      <w:r>
-        <w:t xml:space="preserve"> </w:t>
-      </w:r>
-      <w:r>
-        <w:t xml:space="preserve">reproducing every full prompt. Full prompt text should be placed in supplementary</w:t>
-      </w:r>
-      <w:r>
-        <w:t xml:space="preserve"> </w:t>
-      </w:r>
-      <w:r>
-        <w:t xml:space="preserve">material.</w:t>
-      </w:r>
-    </w:p>
-    <w:p>
-      <w:pPr>
-        <w:pStyle w:val="BodyText"/>
-      </w:pPr>
-      <w:r>
-        <w:t xml:space="preserve">Model outputs are parsed into the six target colour labels or</w:t>
-      </w:r>
-      <w:r>
-        <w:t xml:space="preserve"> </w:t>
-      </w:r>
-      <w:r>
-        <w:rPr>
-          <w:rStyle w:val="VerbatimChar"/>
-        </w:rPr>
-        <w:t xml:space="preserve">other</w:t>
-      </w:r>
-      <w:r>
-        <w:t xml:space="preserve">. The primary</w:t>
-      </w:r>
-      <w:r>
-        <w:t xml:space="preserve"> </w:t>
-      </w:r>
-      <w:r>
-        <w:t xml:space="preserve">C0-C4 outputs remain in the base single-label regime: the parser audit reports 4500</w:t>
-      </w:r>
-      <w:r>
-        <w:t xml:space="preserve"> </w:t>
-      </w:r>
-      <w:r>
-        <w:t xml:space="preserve">main parsed rows with no parse errors, refusals, corrections, or other-wrong outputs.</w:t>
-      </w:r>
-      <w:r>
-        <w:t xml:space="preserve"> </w:t>
-      </w:r>
-      <w:r>
-        <w:t xml:space="preserve">The main metrics are faithfulness rate, conflict-following rate, answer-flip rate,</w:t>
-      </w:r>
-      <w:r>
-        <w:t xml:space="preserve"> </w:t>
-      </w:r>
-      <w:r>
-        <w:t xml:space="preserve">faithful retention rate, and paired exact tests against C0. Holm correction is used for</w:t>
-      </w:r>
-      <w:r>
-        <w:t xml:space="preserve"> </w:t>
-      </w:r>
-      <w:r>
-        <w:t xml:space="preserve">predefined multiple comparisons.</w:t>
-      </w:r>
-    </w:p>
+        <w:t xml:space="preserve">C0 is the neutral reference condition. C1-C4 introduce erroneous colour information with increasing or different forms of textual conflict; full prompt text is reserved for supplementary material.</w:t>
+      </w:r>
+    </w:p>
+    <w:tbl>
+      <w:tblPr>
+        <w:tblStyle w:val="Table"/>
+        <w:tblW w:type="pct" w:w="5000"/>
+        <w:tblLayout w:type="fixed"/>
+        <w:tblLook w:firstRow="1" w:lastRow="0" w:firstColumn="0" w:lastColumn="0" w:noHBand="0" w:noVBand="0" w:val="0020"/>
+      </w:tblPr>
+      <w:tblGrid>
+        <w:gridCol w:w="602"/>
+        <w:gridCol w:w="1667"/>
+        <w:gridCol w:w="3566"/>
+        <w:gridCol w:w="2084"/>
+      </w:tblGrid>
+      <w:tr>
+        <w:trPr>
+          <w:tblHeader w:val="on"/>
+        </w:trPr>
+        <w:tc>
+          <w:tcPr/>
+          <w:p>
+            <w:pPr>
+              <w:pStyle w:val="Compact"/>
+              <w:jc w:val="left"/>
+            </w:pPr>
+            <w:r>
+              <w:t xml:space="preserve">Condition</w:t>
+            </w:r>
+          </w:p>
+        </w:tc>
+        <w:tc>
+          <w:tcPr/>
+          <w:p>
+            <w:pPr>
+              <w:pStyle w:val="Compact"/>
+              <w:jc w:val="left"/>
+            </w:pPr>
+            <w:r>
+              <w:t xml:space="preserve">Role</w:t>
+            </w:r>
+          </w:p>
+        </w:tc>
+        <w:tc>
+          <w:tcPr/>
+          <w:p>
+            <w:pPr>
+              <w:pStyle w:val="Compact"/>
+              <w:jc w:val="left"/>
+            </w:pPr>
+            <w:r>
+              <w:t xml:space="preserve">False-text form</w:t>
+            </w:r>
+          </w:p>
+        </w:tc>
+        <w:tc>
+          <w:tcPr/>
+          <w:p>
+            <w:pPr>
+              <w:pStyle w:val="Compact"/>
+              <w:jc w:val="left"/>
+            </w:pPr>
+            <w:r>
+              <w:t xml:space="preserve">Purpose in analysis</w:t>
+            </w:r>
+          </w:p>
+        </w:tc>
+      </w:tr>
+      <w:tr>
+        <w:tc>
+          <w:tcPr/>
+          <w:p>
+            <w:pPr>
+              <w:pStyle w:val="Compact"/>
+              <w:jc w:val="left"/>
+            </w:pPr>
+            <w:r>
+              <w:t xml:space="preserve">C0</w:t>
+            </w:r>
+          </w:p>
+        </w:tc>
+        <w:tc>
+          <w:tcPr/>
+          <w:p>
+            <w:pPr>
+              <w:pStyle w:val="Compact"/>
+              <w:jc w:val="left"/>
+            </w:pPr>
+            <w:r>
+              <w:t xml:space="preserve">Neutral baseline</w:t>
+            </w:r>
+          </w:p>
+        </w:tc>
+        <w:tc>
+          <w:tcPr/>
+          <w:p>
+            <w:pPr>
+              <w:pStyle w:val="Compact"/>
+              <w:jc w:val="left"/>
+            </w:pPr>
+            <w:r>
+              <w:t xml:space="preserve">No false colour cue</w:t>
+            </w:r>
+          </w:p>
+        </w:tc>
+        <w:tc>
+          <w:tcPr/>
+          <w:p>
+            <w:pPr>
+              <w:pStyle w:val="Compact"/>
+              <w:jc w:val="left"/>
+            </w:pPr>
+            <w:r>
+              <w:t xml:space="preserve">Estimate faithful visual colour recognition</w:t>
+            </w:r>
+          </w:p>
+        </w:tc>
+      </w:tr>
+      <w:tr>
+        <w:tc>
+          <w:tcPr/>
+          <w:p>
+            <w:pPr>
+              <w:pStyle w:val="Compact"/>
+              <w:jc w:val="left"/>
+            </w:pPr>
+            <w:r>
+              <w:t xml:space="preserve">C1</w:t>
+            </w:r>
+          </w:p>
+        </w:tc>
+        <w:tc>
+          <w:tcPr/>
+          <w:p>
+            <w:pPr>
+              <w:pStyle w:val="Compact"/>
+              <w:jc w:val="left"/>
+            </w:pPr>
+            <w:r>
+              <w:t xml:space="preserve">Weak suggestion</w:t>
+            </w:r>
+          </w:p>
+        </w:tc>
+        <w:tc>
+          <w:tcPr/>
+          <w:p>
+            <w:pPr>
+              <w:pStyle w:val="Compact"/>
+              <w:jc w:val="left"/>
+            </w:pPr>
+            <w:r>
+              <w:t xml:space="preserve">Low-strength erroneous colour cue</w:t>
+            </w:r>
+          </w:p>
+        </w:tc>
+        <w:tc>
+          <w:tcPr/>
+          <w:p>
+            <w:pPr>
+              <w:pStyle w:val="Compact"/>
+              <w:jc w:val="left"/>
+            </w:pPr>
+            <w:r>
+              <w:t xml:space="preserve">Test weak textual influence</w:t>
+            </w:r>
+          </w:p>
+        </w:tc>
+      </w:tr>
+      <w:tr>
+        <w:tc>
+          <w:tcPr/>
+          <w:p>
+            <w:pPr>
+              <w:pStyle w:val="Compact"/>
+              <w:jc w:val="left"/>
+            </w:pPr>
+            <w:r>
+              <w:t xml:space="preserve">C2</w:t>
+            </w:r>
+          </w:p>
+        </w:tc>
+        <w:tc>
+          <w:tcPr/>
+          <w:p>
+            <w:pPr>
+              <w:pStyle w:val="Compact"/>
+              <w:jc w:val="left"/>
+            </w:pPr>
+            <w:r>
+              <w:t xml:space="preserve">False assertion</w:t>
+            </w:r>
+          </w:p>
+        </w:tc>
+        <w:tc>
+          <w:tcPr/>
+          <w:p>
+            <w:pPr>
+              <w:pStyle w:val="Compact"/>
+              <w:jc w:val="left"/>
+            </w:pPr>
+            <w:r>
+              <w:t xml:space="preserve">Open prompt with a false colour assertion</w:t>
+            </w:r>
+          </w:p>
+        </w:tc>
+        <w:tc>
+          <w:tcPr/>
+          <w:p>
+            <w:pPr>
+              <w:pStyle w:val="Compact"/>
+              <w:jc w:val="left"/>
+            </w:pPr>
+            <w:r>
+              <w:t xml:space="preserve">Test direct false-text conflict</w:t>
+            </w:r>
+          </w:p>
+        </w:tc>
+      </w:tr>
+      <w:tr>
+        <w:tc>
+          <w:tcPr/>
+          <w:p>
+            <w:pPr>
+              <w:pStyle w:val="Compact"/>
+              <w:jc w:val="left"/>
+            </w:pPr>
+            <w:r>
+              <w:t xml:space="preserve">C3</w:t>
+            </w:r>
+          </w:p>
+        </w:tc>
+        <w:tc>
+          <w:tcPr/>
+          <w:p>
+            <w:pPr>
+              <w:pStyle w:val="Compact"/>
+              <w:jc w:val="left"/>
+            </w:pPr>
+            <w:r>
+              <w:t xml:space="preserve">Presupposition, correction allowed</w:t>
+            </w:r>
+          </w:p>
+        </w:tc>
+        <w:tc>
+          <w:tcPr/>
+          <w:p>
+            <w:pPr>
+              <w:pStyle w:val="Compact"/>
+              <w:jc w:val="left"/>
+            </w:pPr>
+            <w:r>
+              <w:t xml:space="preserve">False colour embedded as a presupposition while correction remains possible</w:t>
+            </w:r>
+          </w:p>
+        </w:tc>
+        <w:tc>
+          <w:tcPr/>
+          <w:p>
+            <w:pPr>
+              <w:pStyle w:val="Compact"/>
+              <w:jc w:val="left"/>
+            </w:pPr>
+            <w:r>
+              <w:t xml:space="preserve">Primary conflict condition</w:t>
+            </w:r>
+          </w:p>
+        </w:tc>
+      </w:tr>
+      <w:tr>
+        <w:tc>
+          <w:tcPr/>
+          <w:p>
+            <w:pPr>
+              <w:pStyle w:val="Compact"/>
+              <w:jc w:val="left"/>
+            </w:pPr>
+            <w:r>
+              <w:t xml:space="preserve">C4</w:t>
+            </w:r>
+          </w:p>
+        </w:tc>
+        <w:tc>
+          <w:tcPr/>
+          <w:p>
+            <w:pPr>
+              <w:pStyle w:val="Compact"/>
+              <w:jc w:val="left"/>
+            </w:pPr>
+            <w:r>
+              <w:t xml:space="preserve">Stronger open conflict</w:t>
+            </w:r>
+          </w:p>
+        </w:tc>
+        <w:tc>
+          <w:tcPr/>
+          <w:p>
+            <w:pPr>
+              <w:pStyle w:val="Compact"/>
+              <w:jc w:val="left"/>
+            </w:pPr>
+            <w:r>
+              <w:t xml:space="preserve">Repeated or stronger false-colour framing</w:t>
+            </w:r>
+          </w:p>
+        </w:tc>
+        <w:tc>
+          <w:tcPr/>
+          <w:p>
+            <w:pPr>
+              <w:pStyle w:val="Compact"/>
+              <w:jc w:val="left"/>
+            </w:pPr>
+            <w:r>
+              <w:t xml:space="preserve">Primary stronger conflict condition</w:t>
+            </w:r>
+          </w:p>
+        </w:tc>
+      </w:tr>
+    </w:tbl>
     <w:bookmarkEnd w:id="21"/>
     <w:bookmarkEnd w:id="22"/>
     <w:bookmarkStart w:id="39" w:name="results"/>
@@ -1026,27 +1661,1019 @@
         <w:t xml:space="preserve"> </w:t>
       </w:r>
       <w:r>
-        <w:t xml:space="preserve">Source file:</w:t>
-      </w:r>
-      <w:r>
-        <w:t xml:space="preserve"> </w:t>
-      </w:r>
-      <w:r>
-        <w:rPr>
-          <w:rStyle w:val="VerbatimChar"/>
-        </w:rPr>
-        <w:t xml:space="preserve">results/main/table1_main_metrics.csv</w:t>
-      </w:r>
-      <w:r>
-        <w:t xml:space="preserve">. The table should report all model-condition</w:t>
-      </w:r>
-      <w:r>
-        <w:t xml:space="preserve"> </w:t>
-      </w:r>
-      <w:r>
-        <w:t xml:space="preserve">rows and highlight LLaVA C3/C4 without suppressing the stable comparator rows.</w:t>
-      </w:r>
-    </w:p>
+        <w:t xml:space="preserve">Values are counts out of 300 with percentages and 95% confidence intervals in brackets. Asterisks and daggers follow the locked source table and mark the primary LLaVA C3/C4 findings.</w:t>
+      </w:r>
+    </w:p>
+    <w:tbl>
+      <w:tblPr>
+        <w:tblStyle w:val="Table"/>
+        <w:tblW w:type="pct" w:w="5000"/>
+        <w:tblLayout w:type="fixed"/>
+        <w:tblLook w:firstRow="1" w:lastRow="0" w:firstColumn="0" w:lastColumn="0" w:noHBand="0" w:noVBand="0" w:val="0020"/>
+      </w:tblPr>
+      <w:tblGrid>
+        <w:gridCol w:w="1569"/>
+        <w:gridCol w:w="927"/>
+        <w:gridCol w:w="356"/>
+        <w:gridCol w:w="2425"/>
+        <w:gridCol w:w="2640"/>
+      </w:tblGrid>
+      <w:tr>
+        <w:trPr>
+          <w:tblHeader w:val="on"/>
+        </w:trPr>
+        <w:tc>
+          <w:tcPr/>
+          <w:p>
+            <w:pPr>
+              <w:pStyle w:val="Compact"/>
+              <w:jc w:val="left"/>
+            </w:pPr>
+            <w:r>
+              <w:t xml:space="preserve">Model</w:t>
+            </w:r>
+          </w:p>
+        </w:tc>
+        <w:tc>
+          <w:tcPr/>
+          <w:p>
+            <w:pPr>
+              <w:pStyle w:val="Compact"/>
+              <w:jc w:val="left"/>
+            </w:pPr>
+            <w:r>
+              <w:t xml:space="preserve">Condition</w:t>
+            </w:r>
+          </w:p>
+        </w:tc>
+        <w:tc>
+          <w:tcPr/>
+          <w:p>
+            <w:pPr>
+              <w:pStyle w:val="Compact"/>
+              <w:jc w:val="right"/>
+            </w:pPr>
+            <w:r>
+              <w:t xml:space="preserve">n</w:t>
+            </w:r>
+          </w:p>
+        </w:tc>
+        <w:tc>
+          <w:tcPr/>
+          <w:p>
+            <w:pPr>
+              <w:pStyle w:val="Compact"/>
+              <w:jc w:val="left"/>
+            </w:pPr>
+            <w:r>
+              <w:t xml:space="preserve">False-colour aligned</w:t>
+            </w:r>
+          </w:p>
+        </w:tc>
+        <w:tc>
+          <w:tcPr/>
+          <w:p>
+            <w:pPr>
+              <w:pStyle w:val="Compact"/>
+              <w:jc w:val="left"/>
+            </w:pPr>
+            <w:r>
+              <w:t xml:space="preserve">Faithful</w:t>
+            </w:r>
+          </w:p>
+        </w:tc>
+      </w:tr>
+      <w:tr>
+        <w:tc>
+          <w:tcPr/>
+          <w:p>
+            <w:pPr>
+              <w:pStyle w:val="Compact"/>
+              <w:jc w:val="left"/>
+            </w:pPr>
+            <w:r>
+              <w:t xml:space="preserve">LLaVA-1.5-7B</w:t>
+            </w:r>
+          </w:p>
+        </w:tc>
+        <w:tc>
+          <w:tcPr/>
+          <w:p>
+            <w:pPr>
+              <w:pStyle w:val="Compact"/>
+              <w:jc w:val="left"/>
+            </w:pPr>
+            <w:r>
+              <w:t xml:space="preserve">C0</w:t>
+            </w:r>
+          </w:p>
+        </w:tc>
+        <w:tc>
+          <w:tcPr/>
+          <w:p>
+            <w:pPr>
+              <w:pStyle w:val="Compact"/>
+              <w:jc w:val="right"/>
+            </w:pPr>
+            <w:r>
+              <w:t xml:space="preserve">300</w:t>
+            </w:r>
+          </w:p>
+        </w:tc>
+        <w:tc>
+          <w:tcPr/>
+          <w:p>
+            <w:pPr>
+              <w:pStyle w:val="Compact"/>
+              <w:jc w:val="left"/>
+            </w:pPr>
+            <w:r>
+              <w:t xml:space="preserve">0/300 (0.00% [0.00%, 1.26%])</w:t>
+            </w:r>
+          </w:p>
+        </w:tc>
+        <w:tc>
+          <w:tcPr/>
+          <w:p>
+            <w:pPr>
+              <w:pStyle w:val="Compact"/>
+              <w:jc w:val="left"/>
+            </w:pPr>
+            <w:r>
+              <w:t xml:space="preserve">300/300 (100.00% [98.74%, 100.00%])</w:t>
+            </w:r>
+          </w:p>
+        </w:tc>
+      </w:tr>
+      <w:tr>
+        <w:tc>
+          <w:tcPr/>
+          <w:p>
+            <w:pPr>
+              <w:pStyle w:val="Compact"/>
+              <w:jc w:val="left"/>
+            </w:pPr>
+            <w:r>
+              <w:t xml:space="preserve">LLaVA-1.5-7B</w:t>
+            </w:r>
+          </w:p>
+        </w:tc>
+        <w:tc>
+          <w:tcPr/>
+          <w:p>
+            <w:pPr>
+              <w:pStyle w:val="Compact"/>
+              <w:jc w:val="left"/>
+            </w:pPr>
+            <w:r>
+              <w:t xml:space="preserve">C1</w:t>
+            </w:r>
+          </w:p>
+        </w:tc>
+        <w:tc>
+          <w:tcPr/>
+          <w:p>
+            <w:pPr>
+              <w:pStyle w:val="Compact"/>
+              <w:jc w:val="right"/>
+            </w:pPr>
+            <w:r>
+              <w:t xml:space="preserve">300</w:t>
+            </w:r>
+          </w:p>
+        </w:tc>
+        <w:tc>
+          <w:tcPr/>
+          <w:p>
+            <w:pPr>
+              <w:pStyle w:val="Compact"/>
+              <w:jc w:val="left"/>
+            </w:pPr>
+            <w:r>
+              <w:t xml:space="preserve">1/300 (0.33% [0.06%, 1.86%])</w:t>
+            </w:r>
+          </w:p>
+        </w:tc>
+        <w:tc>
+          <w:tcPr/>
+          <w:p>
+            <w:pPr>
+              <w:pStyle w:val="Compact"/>
+              <w:jc w:val="left"/>
+            </w:pPr>
+            <w:r>
+              <w:t xml:space="preserve">299/300 (99.67% [98.14%, 99.94%])</w:t>
+            </w:r>
+          </w:p>
+        </w:tc>
+      </w:tr>
+      <w:tr>
+        <w:tc>
+          <w:tcPr/>
+          <w:p>
+            <w:pPr>
+              <w:pStyle w:val="Compact"/>
+              <w:jc w:val="left"/>
+            </w:pPr>
+            <w:r>
+              <w:t xml:space="preserve">LLaVA-1.5-7B</w:t>
+            </w:r>
+          </w:p>
+        </w:tc>
+        <w:tc>
+          <w:tcPr/>
+          <w:p>
+            <w:pPr>
+              <w:pStyle w:val="Compact"/>
+              <w:jc w:val="left"/>
+            </w:pPr>
+            <w:r>
+              <w:t xml:space="preserve">C2</w:t>
+            </w:r>
+          </w:p>
+        </w:tc>
+        <w:tc>
+          <w:tcPr/>
+          <w:p>
+            <w:pPr>
+              <w:pStyle w:val="Compact"/>
+              <w:jc w:val="right"/>
+            </w:pPr>
+            <w:r>
+              <w:t xml:space="preserve">300</w:t>
+            </w:r>
+          </w:p>
+        </w:tc>
+        <w:tc>
+          <w:tcPr/>
+          <w:p>
+            <w:pPr>
+              <w:pStyle w:val="Compact"/>
+              <w:jc w:val="left"/>
+            </w:pPr>
+            <w:r>
+              <w:t xml:space="preserve">3/300 (1.00% [0.34%, 2.90%])</w:t>
+            </w:r>
+          </w:p>
+        </w:tc>
+        <w:tc>
+          <w:tcPr/>
+          <w:p>
+            <w:pPr>
+              <w:pStyle w:val="Compact"/>
+              <w:jc w:val="left"/>
+            </w:pPr>
+            <w:r>
+              <w:t xml:space="preserve">297/300 (99.00% [97.10%, 99.66%])</w:t>
+            </w:r>
+          </w:p>
+        </w:tc>
+      </w:tr>
+      <w:tr>
+        <w:tc>
+          <w:tcPr/>
+          <w:p>
+            <w:pPr>
+              <w:pStyle w:val="Compact"/>
+              <w:jc w:val="left"/>
+            </w:pPr>
+            <w:r>
+              <w:t xml:space="preserve">LLaVA-1.5-7B</w:t>
+            </w:r>
+          </w:p>
+        </w:tc>
+        <w:tc>
+          <w:tcPr/>
+          <w:p>
+            <w:pPr>
+              <w:pStyle w:val="Compact"/>
+              <w:jc w:val="left"/>
+            </w:pPr>
+            <w:r>
+              <w:t xml:space="preserve">C3</w:t>
+            </w:r>
+          </w:p>
+        </w:tc>
+        <w:tc>
+          <w:tcPr/>
+          <w:p>
+            <w:pPr>
+              <w:pStyle w:val="Compact"/>
+              <w:jc w:val="right"/>
+            </w:pPr>
+            <w:r>
+              <w:t xml:space="preserve">300</w:t>
+            </w:r>
+          </w:p>
+        </w:tc>
+        <w:tc>
+          <w:tcPr/>
+          <w:p>
+            <w:pPr>
+              <w:pStyle w:val="Compact"/>
+              <w:jc w:val="left"/>
+            </w:pPr>
+            <w:r>
+              <w:t xml:space="preserve">27/300 (9.00% [6.26%, 12.78%])*†</w:t>
+            </w:r>
+          </w:p>
+        </w:tc>
+        <w:tc>
+          <w:tcPr/>
+          <w:p>
+            <w:pPr>
+              <w:pStyle w:val="Compact"/>
+              <w:jc w:val="left"/>
+            </w:pPr>
+            <w:r>
+              <w:t xml:space="preserve">273/300 (91.00% [87.22%, 93.74%])</w:t>
+            </w:r>
+          </w:p>
+        </w:tc>
+      </w:tr>
+      <w:tr>
+        <w:tc>
+          <w:tcPr/>
+          <w:p>
+            <w:pPr>
+              <w:pStyle w:val="Compact"/>
+              <w:jc w:val="left"/>
+            </w:pPr>
+            <w:r>
+              <w:t xml:space="preserve">LLaVA-1.5-7B</w:t>
+            </w:r>
+          </w:p>
+        </w:tc>
+        <w:tc>
+          <w:tcPr/>
+          <w:p>
+            <w:pPr>
+              <w:pStyle w:val="Compact"/>
+              <w:jc w:val="left"/>
+            </w:pPr>
+            <w:r>
+              <w:t xml:space="preserve">C4</w:t>
+            </w:r>
+          </w:p>
+        </w:tc>
+        <w:tc>
+          <w:tcPr/>
+          <w:p>
+            <w:pPr>
+              <w:pStyle w:val="Compact"/>
+              <w:jc w:val="right"/>
+            </w:pPr>
+            <w:r>
+              <w:t xml:space="preserve">300</w:t>
+            </w:r>
+          </w:p>
+        </w:tc>
+        <w:tc>
+          <w:tcPr/>
+          <w:p>
+            <w:pPr>
+              <w:pStyle w:val="Compact"/>
+              <w:jc w:val="left"/>
+            </w:pPr>
+            <w:r>
+              <w:t xml:space="preserve">10/300 (3.33% [1.82%, 6.03%])*†</w:t>
+            </w:r>
+          </w:p>
+        </w:tc>
+        <w:tc>
+          <w:tcPr/>
+          <w:p>
+            <w:pPr>
+              <w:pStyle w:val="Compact"/>
+              <w:jc w:val="left"/>
+            </w:pPr>
+            <w:r>
+              <w:t xml:space="preserve">290/300 (96.67% [93.97%, 98.18%])</w:t>
+            </w:r>
+          </w:p>
+        </w:tc>
+      </w:tr>
+      <w:tr>
+        <w:tc>
+          <w:tcPr/>
+          <w:p>
+            <w:pPr>
+              <w:pStyle w:val="Compact"/>
+              <w:jc w:val="left"/>
+            </w:pPr>
+            <w:r>
+              <w:t xml:space="preserve">Qwen2-VL-7B-Instruct</w:t>
+            </w:r>
+          </w:p>
+        </w:tc>
+        <w:tc>
+          <w:tcPr/>
+          <w:p>
+            <w:pPr>
+              <w:pStyle w:val="Compact"/>
+              <w:jc w:val="left"/>
+            </w:pPr>
+            <w:r>
+              <w:t xml:space="preserve">C0</w:t>
+            </w:r>
+          </w:p>
+        </w:tc>
+        <w:tc>
+          <w:tcPr/>
+          <w:p>
+            <w:pPr>
+              <w:pStyle w:val="Compact"/>
+              <w:jc w:val="right"/>
+            </w:pPr>
+            <w:r>
+              <w:t xml:space="preserve">300</w:t>
+            </w:r>
+          </w:p>
+        </w:tc>
+        <w:tc>
+          <w:tcPr/>
+          <w:p>
+            <w:pPr>
+              <w:pStyle w:val="Compact"/>
+              <w:jc w:val="left"/>
+            </w:pPr>
+            <w:r>
+              <w:t xml:space="preserve">0/300 (0.00% [0.00%, 1.26%])</w:t>
+            </w:r>
+          </w:p>
+        </w:tc>
+        <w:tc>
+          <w:tcPr/>
+          <w:p>
+            <w:pPr>
+              <w:pStyle w:val="Compact"/>
+              <w:jc w:val="left"/>
+            </w:pPr>
+            <w:r>
+              <w:t xml:space="preserve">300/300 (100.00% [98.74%, 100.00%])</w:t>
+            </w:r>
+          </w:p>
+        </w:tc>
+      </w:tr>
+      <w:tr>
+        <w:tc>
+          <w:tcPr/>
+          <w:p>
+            <w:pPr>
+              <w:pStyle w:val="Compact"/>
+              <w:jc w:val="left"/>
+            </w:pPr>
+            <w:r>
+              <w:t xml:space="preserve">Qwen2-VL-7B-Instruct</w:t>
+            </w:r>
+          </w:p>
+        </w:tc>
+        <w:tc>
+          <w:tcPr/>
+          <w:p>
+            <w:pPr>
+              <w:pStyle w:val="Compact"/>
+              <w:jc w:val="left"/>
+            </w:pPr>
+            <w:r>
+              <w:t xml:space="preserve">C1</w:t>
+            </w:r>
+          </w:p>
+        </w:tc>
+        <w:tc>
+          <w:tcPr/>
+          <w:p>
+            <w:pPr>
+              <w:pStyle w:val="Compact"/>
+              <w:jc w:val="right"/>
+            </w:pPr>
+            <w:r>
+              <w:t xml:space="preserve">300</w:t>
+            </w:r>
+          </w:p>
+        </w:tc>
+        <w:tc>
+          <w:tcPr/>
+          <w:p>
+            <w:pPr>
+              <w:pStyle w:val="Compact"/>
+              <w:jc w:val="left"/>
+            </w:pPr>
+            <w:r>
+              <w:t xml:space="preserve">0/300 (0.00% [0.00%, 1.26%])</w:t>
+            </w:r>
+          </w:p>
+        </w:tc>
+        <w:tc>
+          <w:tcPr/>
+          <w:p>
+            <w:pPr>
+              <w:pStyle w:val="Compact"/>
+              <w:jc w:val="left"/>
+            </w:pPr>
+            <w:r>
+              <w:t xml:space="preserve">300/300 (100.00% [98.74%, 100.00%])</w:t>
+            </w:r>
+          </w:p>
+        </w:tc>
+      </w:tr>
+      <w:tr>
+        <w:tc>
+          <w:tcPr/>
+          <w:p>
+            <w:pPr>
+              <w:pStyle w:val="Compact"/>
+              <w:jc w:val="left"/>
+            </w:pPr>
+            <w:r>
+              <w:t xml:space="preserve">Qwen2-VL-7B-Instruct</w:t>
+            </w:r>
+          </w:p>
+        </w:tc>
+        <w:tc>
+          <w:tcPr/>
+          <w:p>
+            <w:pPr>
+              <w:pStyle w:val="Compact"/>
+              <w:jc w:val="left"/>
+            </w:pPr>
+            <w:r>
+              <w:t xml:space="preserve">C2</w:t>
+            </w:r>
+          </w:p>
+        </w:tc>
+        <w:tc>
+          <w:tcPr/>
+          <w:p>
+            <w:pPr>
+              <w:pStyle w:val="Compact"/>
+              <w:jc w:val="right"/>
+            </w:pPr>
+            <w:r>
+              <w:t xml:space="preserve">300</w:t>
+            </w:r>
+          </w:p>
+        </w:tc>
+        <w:tc>
+          <w:tcPr/>
+          <w:p>
+            <w:pPr>
+              <w:pStyle w:val="Compact"/>
+              <w:jc w:val="left"/>
+            </w:pPr>
+            <w:r>
+              <w:t xml:space="preserve">0/300 (0.00% [0.00%, 1.26%])</w:t>
+            </w:r>
+          </w:p>
+        </w:tc>
+        <w:tc>
+          <w:tcPr/>
+          <w:p>
+            <w:pPr>
+              <w:pStyle w:val="Compact"/>
+              <w:jc w:val="left"/>
+            </w:pPr>
+            <w:r>
+              <w:t xml:space="preserve">300/300 (100.00% [98.74%, 100.00%])</w:t>
+            </w:r>
+          </w:p>
+        </w:tc>
+      </w:tr>
+      <w:tr>
+        <w:tc>
+          <w:tcPr/>
+          <w:p>
+            <w:pPr>
+              <w:pStyle w:val="Compact"/>
+              <w:jc w:val="left"/>
+            </w:pPr>
+            <w:r>
+              <w:t xml:space="preserve">Qwen2-VL-7B-Instruct</w:t>
+            </w:r>
+          </w:p>
+        </w:tc>
+        <w:tc>
+          <w:tcPr/>
+          <w:p>
+            <w:pPr>
+              <w:pStyle w:val="Compact"/>
+              <w:jc w:val="left"/>
+            </w:pPr>
+            <w:r>
+              <w:t xml:space="preserve">C3</w:t>
+            </w:r>
+          </w:p>
+        </w:tc>
+        <w:tc>
+          <w:tcPr/>
+          <w:p>
+            <w:pPr>
+              <w:pStyle w:val="Compact"/>
+              <w:jc w:val="right"/>
+            </w:pPr>
+            <w:r>
+              <w:t xml:space="preserve">300</w:t>
+            </w:r>
+          </w:p>
+        </w:tc>
+        <w:tc>
+          <w:tcPr/>
+          <w:p>
+            <w:pPr>
+              <w:pStyle w:val="Compact"/>
+              <w:jc w:val="left"/>
+            </w:pPr>
+            <w:r>
+              <w:t xml:space="preserve">1/300 (0.33% [0.06%, 1.86%])</w:t>
+            </w:r>
+          </w:p>
+        </w:tc>
+        <w:tc>
+          <w:tcPr/>
+          <w:p>
+            <w:pPr>
+              <w:pStyle w:val="Compact"/>
+              <w:jc w:val="left"/>
+            </w:pPr>
+            <w:r>
+              <w:t xml:space="preserve">299/300 (99.67% [98.14%, 99.94%])</w:t>
+            </w:r>
+          </w:p>
+        </w:tc>
+      </w:tr>
+      <w:tr>
+        <w:tc>
+          <w:tcPr/>
+          <w:p>
+            <w:pPr>
+              <w:pStyle w:val="Compact"/>
+              <w:jc w:val="left"/>
+            </w:pPr>
+            <w:r>
+              <w:t xml:space="preserve">Qwen2-VL-7B-Instruct</w:t>
+            </w:r>
+          </w:p>
+        </w:tc>
+        <w:tc>
+          <w:tcPr/>
+          <w:p>
+            <w:pPr>
+              <w:pStyle w:val="Compact"/>
+              <w:jc w:val="left"/>
+            </w:pPr>
+            <w:r>
+              <w:t xml:space="preserve">C4</w:t>
+            </w:r>
+          </w:p>
+        </w:tc>
+        <w:tc>
+          <w:tcPr/>
+          <w:p>
+            <w:pPr>
+              <w:pStyle w:val="Compact"/>
+              <w:jc w:val="right"/>
+            </w:pPr>
+            <w:r>
+              <w:t xml:space="preserve">300</w:t>
+            </w:r>
+          </w:p>
+        </w:tc>
+        <w:tc>
+          <w:tcPr/>
+          <w:p>
+            <w:pPr>
+              <w:pStyle w:val="Compact"/>
+              <w:jc w:val="left"/>
+            </w:pPr>
+            <w:r>
+              <w:t xml:space="preserve">1/300 (0.33% [0.06%, 1.86%])</w:t>
+            </w:r>
+          </w:p>
+        </w:tc>
+        <w:tc>
+          <w:tcPr/>
+          <w:p>
+            <w:pPr>
+              <w:pStyle w:val="Compact"/>
+              <w:jc w:val="left"/>
+            </w:pPr>
+            <w:r>
+              <w:t xml:space="preserve">299/300 (99.67% [98.14%, 99.94%])</w:t>
+            </w:r>
+          </w:p>
+        </w:tc>
+      </w:tr>
+      <w:tr>
+        <w:tc>
+          <w:tcPr/>
+          <w:p>
+            <w:pPr>
+              <w:pStyle w:val="Compact"/>
+              <w:jc w:val="left"/>
+            </w:pPr>
+            <w:r>
+              <w:t xml:space="preserve">InternVL2-8B</w:t>
+            </w:r>
+          </w:p>
+        </w:tc>
+        <w:tc>
+          <w:tcPr/>
+          <w:p>
+            <w:pPr>
+              <w:pStyle w:val="Compact"/>
+              <w:jc w:val="left"/>
+            </w:pPr>
+            <w:r>
+              <w:t xml:space="preserve">C0</w:t>
+            </w:r>
+          </w:p>
+        </w:tc>
+        <w:tc>
+          <w:tcPr/>
+          <w:p>
+            <w:pPr>
+              <w:pStyle w:val="Compact"/>
+              <w:jc w:val="right"/>
+            </w:pPr>
+            <w:r>
+              <w:t xml:space="preserve">300</w:t>
+            </w:r>
+          </w:p>
+        </w:tc>
+        <w:tc>
+          <w:tcPr/>
+          <w:p>
+            <w:pPr>
+              <w:pStyle w:val="Compact"/>
+              <w:jc w:val="left"/>
+            </w:pPr>
+            <w:r>
+              <w:t xml:space="preserve">0/300 (0.00% [0.00%, 1.26%])</w:t>
+            </w:r>
+          </w:p>
+        </w:tc>
+        <w:tc>
+          <w:tcPr/>
+          <w:p>
+            <w:pPr>
+              <w:pStyle w:val="Compact"/>
+              <w:jc w:val="left"/>
+            </w:pPr>
+            <w:r>
+              <w:t xml:space="preserve">300/300 (100.00% [98.74%, 100.00%])</w:t>
+            </w:r>
+          </w:p>
+        </w:tc>
+      </w:tr>
+      <w:tr>
+        <w:tc>
+          <w:tcPr/>
+          <w:p>
+            <w:pPr>
+              <w:pStyle w:val="Compact"/>
+              <w:jc w:val="left"/>
+            </w:pPr>
+            <w:r>
+              <w:t xml:space="preserve">InternVL2-8B</w:t>
+            </w:r>
+          </w:p>
+        </w:tc>
+        <w:tc>
+          <w:tcPr/>
+          <w:p>
+            <w:pPr>
+              <w:pStyle w:val="Compact"/>
+              <w:jc w:val="left"/>
+            </w:pPr>
+            <w:r>
+              <w:t xml:space="preserve">C1</w:t>
+            </w:r>
+          </w:p>
+        </w:tc>
+        <w:tc>
+          <w:tcPr/>
+          <w:p>
+            <w:pPr>
+              <w:pStyle w:val="Compact"/>
+              <w:jc w:val="right"/>
+            </w:pPr>
+            <w:r>
+              <w:t xml:space="preserve">300</w:t>
+            </w:r>
+          </w:p>
+        </w:tc>
+        <w:tc>
+          <w:tcPr/>
+          <w:p>
+            <w:pPr>
+              <w:pStyle w:val="Compact"/>
+              <w:jc w:val="left"/>
+            </w:pPr>
+            <w:r>
+              <w:t xml:space="preserve">0/300 (0.00% [0.00%, 1.26%])</w:t>
+            </w:r>
+          </w:p>
+        </w:tc>
+        <w:tc>
+          <w:tcPr/>
+          <w:p>
+            <w:pPr>
+              <w:pStyle w:val="Compact"/>
+              <w:jc w:val="left"/>
+            </w:pPr>
+            <w:r>
+              <w:t xml:space="preserve">300/300 (100.00% [98.74%, 100.00%])</w:t>
+            </w:r>
+          </w:p>
+        </w:tc>
+      </w:tr>
+      <w:tr>
+        <w:tc>
+          <w:tcPr/>
+          <w:p>
+            <w:pPr>
+              <w:pStyle w:val="Compact"/>
+              <w:jc w:val="left"/>
+            </w:pPr>
+            <w:r>
+              <w:t xml:space="preserve">InternVL2-8B</w:t>
+            </w:r>
+          </w:p>
+        </w:tc>
+        <w:tc>
+          <w:tcPr/>
+          <w:p>
+            <w:pPr>
+              <w:pStyle w:val="Compact"/>
+              <w:jc w:val="left"/>
+            </w:pPr>
+            <w:r>
+              <w:t xml:space="preserve">C2</w:t>
+            </w:r>
+          </w:p>
+        </w:tc>
+        <w:tc>
+          <w:tcPr/>
+          <w:p>
+            <w:pPr>
+              <w:pStyle w:val="Compact"/>
+              <w:jc w:val="right"/>
+            </w:pPr>
+            <w:r>
+              <w:t xml:space="preserve">300</w:t>
+            </w:r>
+          </w:p>
+        </w:tc>
+        <w:tc>
+          <w:tcPr/>
+          <w:p>
+            <w:pPr>
+              <w:pStyle w:val="Compact"/>
+              <w:jc w:val="left"/>
+            </w:pPr>
+            <w:r>
+              <w:t xml:space="preserve">0/300 (0.00% [0.00%, 1.26%])</w:t>
+            </w:r>
+          </w:p>
+        </w:tc>
+        <w:tc>
+          <w:tcPr/>
+          <w:p>
+            <w:pPr>
+              <w:pStyle w:val="Compact"/>
+              <w:jc w:val="left"/>
+            </w:pPr>
+            <w:r>
+              <w:t xml:space="preserve">300/300 (100.00% [98.74%, 100.00%])</w:t>
+            </w:r>
+          </w:p>
+        </w:tc>
+      </w:tr>
+      <w:tr>
+        <w:tc>
+          <w:tcPr/>
+          <w:p>
+            <w:pPr>
+              <w:pStyle w:val="Compact"/>
+              <w:jc w:val="left"/>
+            </w:pPr>
+            <w:r>
+              <w:t xml:space="preserve">InternVL2-8B</w:t>
+            </w:r>
+          </w:p>
+        </w:tc>
+        <w:tc>
+          <w:tcPr/>
+          <w:p>
+            <w:pPr>
+              <w:pStyle w:val="Compact"/>
+              <w:jc w:val="left"/>
+            </w:pPr>
+            <w:r>
+              <w:t xml:space="preserve">C3</w:t>
+            </w:r>
+          </w:p>
+        </w:tc>
+        <w:tc>
+          <w:tcPr/>
+          <w:p>
+            <w:pPr>
+              <w:pStyle w:val="Compact"/>
+              <w:jc w:val="right"/>
+            </w:pPr>
+            <w:r>
+              <w:t xml:space="preserve">300</w:t>
+            </w:r>
+          </w:p>
+        </w:tc>
+        <w:tc>
+          <w:tcPr/>
+          <w:p>
+            <w:pPr>
+              <w:pStyle w:val="Compact"/>
+              <w:jc w:val="left"/>
+            </w:pPr>
+            <w:r>
+              <w:t xml:space="preserve">0/300 (0.00% [0.00%, 1.26%])</w:t>
+            </w:r>
+          </w:p>
+        </w:tc>
+        <w:tc>
+          <w:tcPr/>
+          <w:p>
+            <w:pPr>
+              <w:pStyle w:val="Compact"/>
+              <w:jc w:val="left"/>
+            </w:pPr>
+            <w:r>
+              <w:t xml:space="preserve">300/300 (100.00% [98.74%, 100.00%])</w:t>
+            </w:r>
+          </w:p>
+        </w:tc>
+      </w:tr>
+      <w:tr>
+        <w:tc>
+          <w:tcPr/>
+          <w:p>
+            <w:pPr>
+              <w:pStyle w:val="Compact"/>
+              <w:jc w:val="left"/>
+            </w:pPr>
+            <w:r>
+              <w:t xml:space="preserve">InternVL2-8B</w:t>
+            </w:r>
+          </w:p>
+        </w:tc>
+        <w:tc>
+          <w:tcPr/>
+          <w:p>
+            <w:pPr>
+              <w:pStyle w:val="Compact"/>
+              <w:jc w:val="left"/>
+            </w:pPr>
+            <w:r>
+              <w:t xml:space="preserve">C4</w:t>
+            </w:r>
+          </w:p>
+        </w:tc>
+        <w:tc>
+          <w:tcPr/>
+          <w:p>
+            <w:pPr>
+              <w:pStyle w:val="Compact"/>
+              <w:jc w:val="right"/>
+            </w:pPr>
+            <w:r>
+              <w:t xml:space="preserve">300</w:t>
+            </w:r>
+          </w:p>
+        </w:tc>
+        <w:tc>
+          <w:tcPr/>
+          <w:p>
+            <w:pPr>
+              <w:pStyle w:val="Compact"/>
+              <w:jc w:val="left"/>
+            </w:pPr>
+            <w:r>
+              <w:t xml:space="preserve">0/300 (0.00% [0.00%, 1.26%])</w:t>
+            </w:r>
+          </w:p>
+        </w:tc>
+        <w:tc>
+          <w:tcPr/>
+          <w:p>
+            <w:pPr>
+              <w:pStyle w:val="Compact"/>
+              <w:jc w:val="left"/>
+            </w:pPr>
+            <w:r>
+              <w:t xml:space="preserve">300/300 (100.00% [98.74%, 100.00%])</w:t>
+            </w:r>
+          </w:p>
+        </w:tc>
+      </w:tr>
+    </w:tbl>
     <w:bookmarkEnd w:id="23"/>
     <w:bookmarkStart w:id="27" w:name="X559092dc33149abda0a5dac5965ed2fbbcd0b0d"/>
     <w:p>
@@ -1171,37 +2798,19 @@
         <w:t xml:space="preserve"> </w:t>
       </w:r>
       <w:r>
-        <w:t xml:space="preserve">File stem:</w:t>
-      </w:r>
-      <w:r>
-        <w:t xml:space="preserve"> </w:t>
-      </w:r>
-      <w:r>
-        <w:rPr>
-          <w:rStyle w:val="VerbatimChar"/>
-        </w:rPr>
-        <w:t xml:space="preserve">figures/conference/figure2_main_conflict_rates</w:t>
-      </w:r>
-      <w:r>
-        <w:t xml:space="preserve">. Points show false-colour-aligned</w:t>
-      </w:r>
-      <w:r>
-        <w:t xml:space="preserve"> </w:t>
-      </w:r>
-      <w:r>
-        <w:t xml:space="preserve">output rates for each model-condition cell with Wilson confidence intervals from</w:t>
-      </w:r>
-      <w:r>
-        <w:t xml:space="preserve"> </w:t>
-      </w:r>
-      <w:r>
-        <w:rPr>
-          <w:rStyle w:val="VerbatimChar"/>
-        </w:rPr>
-        <w:t xml:space="preserve">results/main/main_condition_metrics.csv</w:t>
-      </w:r>
-      <w:r>
-        <w:t xml:space="preserve">. Non-zero labels mark counts out of 300.</w:t>
+        <w:t xml:space="preserve">Points show false-colour-aligned</w:t>
+      </w:r>
+      <w:r>
+        <w:t xml:space="preserve"> </w:t>
+      </w:r>
+      <w:r>
+        <w:t xml:space="preserve">output rates for each model-condition cell with Wilson confidence intervals. Non-zero</w:t>
+      </w:r>
+      <w:r>
+        <w:t xml:space="preserve"> </w:t>
+      </w:r>
+      <w:r>
+        <w:t xml:space="preserve">labels mark counts out of 300.</w:t>
       </w:r>
     </w:p>
     <w:bookmarkEnd w:id="27"/>
@@ -1334,37 +2943,13 @@
         <w:t xml:space="preserve"> </w:t>
       </w:r>
       <w:r>
-        <w:t xml:space="preserve">File stem:</w:t>
-      </w:r>
-      <w:r>
-        <w:t xml:space="preserve"> </w:t>
-      </w:r>
-      <w:r>
-        <w:rPr>
-          <w:rStyle w:val="VerbatimChar"/>
-        </w:rPr>
-        <w:t xml:space="preserve">figures/conference/figure3_paired_flips</w:t>
-      </w:r>
-      <w:r>
-        <w:t xml:space="preserve">. Bars show the number of images for which a</w:t>
-      </w:r>
-      <w:r>
-        <w:t xml:space="preserve"> </w:t>
-      </w:r>
-      <w:r>
-        <w:t xml:space="preserve">model is faithful under C0 and false-colour-aligned under C1-C4, using</w:t>
-      </w:r>
-      <w:r>
-        <w:t xml:space="preserve"> </w:t>
-      </w:r>
-      <w:r>
-        <w:rPr>
-          <w:rStyle w:val="VerbatimChar"/>
-        </w:rPr>
-        <w:t xml:space="preserve">results/main/paired_flip_metrics.csv</w:t>
-      </w:r>
-      <w:r>
-        <w:t xml:space="preserve">.</w:t>
+        <w:t xml:space="preserve">Bars show the number of</w:t>
+      </w:r>
+      <w:r>
+        <w:t xml:space="preserve"> </w:t>
+      </w:r>
+      <w:r>
+        <w:t xml:space="preserve">images for which a model is faithful under C0 and false-colour-aligned under C1-C4.</w:t>
       </w:r>
     </w:p>
     <w:bookmarkEnd w:id="31"/>
@@ -1609,31 +3194,25 @@
         <w:t xml:space="preserve"> </w:t>
       </w:r>
       <w:r>
-        <w:t xml:space="preserve">File stem:</w:t>
-      </w:r>
-      <w:r>
-        <w:t xml:space="preserve"> </w:t>
-      </w:r>
-      <w:r>
-        <w:rPr>
-          <w:rStyle w:val="VerbatimChar"/>
-        </w:rPr>
-        <w:t xml:space="preserve">figures/conference/figure4_boundary_diagnostics</w:t>
-      </w:r>
-      <w:r>
-        <w:t xml:space="preserve">. Panels summarise C3 wording</w:t>
-      </w:r>
-      <w:r>
-        <w:t xml:space="preserve"> </w:t>
-      </w:r>
-      <w:r>
-        <w:t xml:space="preserve">robustness, answer-format controls, colour-pair concentration, and factorized-prompt</w:t>
-      </w:r>
-      <w:r>
-        <w:t xml:space="preserve"> </w:t>
-      </w:r>
-      <w:r>
-        <w:t xml:space="preserve">effects. This figure bounds the primary claim rather than replacing it.</w:t>
+        <w:t xml:space="preserve">Panels summarise C3</w:t>
+      </w:r>
+      <w:r>
+        <w:t xml:space="preserve"> </w:t>
+      </w:r>
+      <w:r>
+        <w:t xml:space="preserve">wording robustness, answer-format controls, colour-pair concentration, and</w:t>
+      </w:r>
+      <w:r>
+        <w:t xml:space="preserve"> </w:t>
+      </w:r>
+      <w:r>
+        <w:t xml:space="preserve">factorized-prompt effects. This figure bounds the primary claim rather than replacing</w:t>
+      </w:r>
+      <w:r>
+        <w:t xml:space="preserve"> </w:t>
+      </w:r>
+      <w:r>
+        <w:t xml:space="preserve">it.</w:t>
       </w:r>
     </w:p>
     <w:bookmarkEnd w:id="36"/>

</xml_diff>

<commit_message>
Insert cartoon narrative figures into manuscript
</commit_message>
<xml_diff>
--- a/deliverables/conference_submission_draft/conference_manuscript_with_figures.docx
+++ b/deliverables/conference_submission_draft/conference_manuscript_with_figures.docx
@@ -10,7 +10,7 @@
         <w:t xml:space="preserve">False Colour Cues Reveal Local Paired Shifts in Car-Colour VLMs</w:t>
       </w:r>
     </w:p>
-    <w:bookmarkStart w:id="45" w:name="X36981489e51d4ab08f511a328bdbf275c003766"/>
+    <w:bookmarkStart w:id="54" w:name="X36981489e51d4ab08f511a328bdbf275c003766"/>
     <w:p>
       <w:pPr>
         <w:pStyle w:val="Heading1"/>
@@ -133,7 +133,7 @@
       </w:r>
     </w:p>
     <w:bookmarkEnd w:id="9"/>
-    <w:bookmarkStart w:id="13" w:name="introduction"/>
+    <w:bookmarkStart w:id="19" w:name="introduction"/>
     <w:p>
       <w:pPr>
         <w:pStyle w:val="Heading2"/>
@@ -389,20 +389,186 @@
       <w:r>
         <w:drawing>
           <wp:inline>
-            <wp:extent cx="5334000" cy="1636355"/>
+            <wp:extent cx="5334000" cy="3459691"/>
             <wp:effectExtent b="0" l="0" r="0" t="0"/>
             <wp:docPr descr="" title="" id="11" name="Picture"/>
             <a:graphic>
               <a:graphicData uri="http://schemas.openxmlformats.org/drawingml/2006/picture">
                 <pic:pic>
                   <pic:nvPicPr>
-                    <pic:cNvPr descr="images/figure1_evidence_chain.png" id="12" name="Picture"/>
+                    <pic:cNvPr descr="images/graphical_abstract_real_case.png" id="12" name="Picture"/>
                     <pic:cNvPicPr>
                       <a:picLocks noChangeArrowheads="1" noChangeAspect="1"/>
                     </pic:cNvPicPr>
                   </pic:nvPicPr>
                   <pic:blipFill>
                     <a:blip r:embed="rId10"/>
+                    <a:stretch>
+                      <a:fillRect/>
+                    </a:stretch>
+                  </pic:blipFill>
+                  <pic:spPr bwMode="auto">
+                    <a:xfrm>
+                      <a:off x="0" y="0"/>
+                      <a:ext cx="5334000" cy="3459691"/>
+                    </a:xfrm>
+                    <a:prstGeom prst="rect">
+                      <a:avLst/>
+                    </a:prstGeom>
+                    <a:noFill/>
+                    <a:ln w="9525">
+                      <a:noFill/>
+                      <a:headEnd/>
+                      <a:tailEnd/>
+                    </a:ln>
+                  </pic:spPr>
+                </pic:pic>
+              </a:graphicData>
+            </a:graphic>
+          </wp:inline>
+        </w:drawing>
+      </w:r>
+    </w:p>
+    <w:p>
+      <w:pPr>
+        <w:pStyle w:val="BodyText"/>
+      </w:pPr>
+      <w:r>
+        <w:rPr>
+          <w:b/>
+          <w:bCs/>
+        </w:rPr>
+        <w:t xml:space="preserve">Graphical overview. Real-prompt paired workflow.</w:t>
+      </w:r>
+      <w:r>
+        <w:t xml:space="preserve"> </w:t>
+      </w:r>
+      <w:r>
+        <w:t xml:space="preserve">This illustrative panel uses one</w:t>
+      </w:r>
+      <w:r>
+        <w:t xml:space="preserve"> </w:t>
+      </w:r>
+      <w:r>
+        <w:t xml:space="preserve">actual paired LLaVA example to show the experimental unit: the same image is evaluated</w:t>
+      </w:r>
+      <w:r>
+        <w:t xml:space="preserve"> </w:t>
+      </w:r>
+      <w:r>
+        <w:t xml:space="preserve">with the neutral C0 prompt and the false-colour C3 prompt, and the parsed answer changes</w:t>
+      </w:r>
+      <w:r>
+        <w:t xml:space="preserve"> </w:t>
+      </w:r>
+      <w:r>
+        <w:t xml:space="preserve">from the true colour to the embedded false cue. The panel is a reader aid rather than</w:t>
+      </w:r>
+      <w:r>
+        <w:t xml:space="preserve"> </w:t>
+      </w:r>
+      <w:r>
+        <w:t xml:space="preserve">primary evidence.</w:t>
+      </w:r>
+    </w:p>
+    <w:p>
+      <w:pPr>
+        <w:pStyle w:val="BodyText"/>
+      </w:pPr>
+      <w:r>
+        <w:drawing>
+          <wp:inline>
+            <wp:extent cx="5334000" cy="2299137"/>
+            <wp:effectExtent b="0" l="0" r="0" t="0"/>
+            <wp:docPr descr="" title="" id="14" name="Picture"/>
+            <a:graphic>
+              <a:graphicData uri="http://schemas.openxmlformats.org/drawingml/2006/picture">
+                <pic:pic>
+                  <pic:nvPicPr>
+                    <pic:cNvPr descr="images/manuscript_argument_roadmap.png" id="15" name="Picture"/>
+                    <pic:cNvPicPr>
+                      <a:picLocks noChangeArrowheads="1" noChangeAspect="1"/>
+                    </pic:cNvPicPr>
+                  </pic:nvPicPr>
+                  <pic:blipFill>
+                    <a:blip r:embed="rId13"/>
+                    <a:stretch>
+                      <a:fillRect/>
+                    </a:stretch>
+                  </pic:blipFill>
+                  <pic:spPr bwMode="auto">
+                    <a:xfrm>
+                      <a:off x="0" y="0"/>
+                      <a:ext cx="5334000" cy="2299137"/>
+                    </a:xfrm>
+                    <a:prstGeom prst="rect">
+                      <a:avLst/>
+                    </a:prstGeom>
+                    <a:noFill/>
+                    <a:ln w="9525">
+                      <a:noFill/>
+                      <a:headEnd/>
+                      <a:tailEnd/>
+                    </a:ln>
+                  </pic:spPr>
+                </pic:pic>
+              </a:graphicData>
+            </a:graphic>
+          </wp:inline>
+        </w:drawing>
+      </w:r>
+    </w:p>
+    <w:p>
+      <w:pPr>
+        <w:pStyle w:val="BodyText"/>
+      </w:pPr>
+      <w:r>
+        <w:rPr>
+          <w:b/>
+          <w:bCs/>
+        </w:rPr>
+        <w:t xml:space="preserve">Reader map. Argument path of the manuscript.</w:t>
+      </w:r>
+      <w:r>
+        <w:t xml:space="preserve"> </w:t>
+      </w:r>
+      <w:r>
+        <w:t xml:space="preserve">This visual guide summarises the paper’s</w:t>
+      </w:r>
+      <w:r>
+        <w:t xml:space="preserve"> </w:t>
+      </w:r>
+      <w:r>
+        <w:t xml:space="preserve">logic from question, paired evidence, and observed shift to diagnostics, validity checks,</w:t>
+      </w:r>
+      <w:r>
+        <w:t xml:space="preserve"> </w:t>
+      </w:r>
+      <w:r>
+        <w:t xml:space="preserve">and a bounded claim. It is intended to orient the reader before the quantitative figures.</w:t>
+      </w:r>
+    </w:p>
+    <w:p>
+      <w:pPr>
+        <w:pStyle w:val="BodyText"/>
+      </w:pPr>
+      <w:r>
+        <w:drawing>
+          <wp:inline>
+            <wp:extent cx="5334000" cy="1636355"/>
+            <wp:effectExtent b="0" l="0" r="0" t="0"/>
+            <wp:docPr descr="" title="" id="17" name="Picture"/>
+            <a:graphic>
+              <a:graphicData uri="http://schemas.openxmlformats.org/drawingml/2006/picture">
+                <pic:pic>
+                  <pic:nvPicPr>
+                    <pic:cNvPr descr="images/figure1_evidence_chain.png" id="18" name="Picture"/>
+                    <pic:cNvPicPr>
+                      <a:picLocks noChangeArrowheads="1" noChangeAspect="1"/>
+                    </pic:cNvPicPr>
+                  </pic:nvPicPr>
+                  <pic:blipFill>
+                    <a:blip r:embed="rId16"/>
                     <a:stretch>
                       <a:fillRect/>
                     </a:stretch>
@@ -459,8 +625,8 @@
         <w:t xml:space="preserve">prompts, paired flip definition, and boundary diagnostics.</w:t>
       </w:r>
     </w:p>
-    <w:bookmarkEnd w:id="13"/>
-    <w:bookmarkStart w:id="17" w:name="related-work"/>
+    <w:bookmarkEnd w:id="19"/>
+    <w:bookmarkStart w:id="23" w:name="related-work"/>
     <w:p>
       <w:pPr>
         <w:pStyle w:val="Heading2"/>
@@ -469,7 +635,7 @@
         <w:t xml:space="preserve">2. Related Work</w:t>
       </w:r>
     </w:p>
-    <w:bookmarkStart w:id="14" w:name="X859a692aaf4fcdd5703774225666d1b9d51cb87"/>
+    <w:bookmarkStart w:id="20" w:name="X859a692aaf4fcdd5703774225666d1b9d51cb87"/>
     <w:p>
       <w:pPr>
         <w:pStyle w:val="Heading3"/>
@@ -516,8 +682,8 @@
         <w:t xml:space="preserve">and by treating same-image paired flips as the primary evidence unit.</w:t>
       </w:r>
     </w:p>
-    <w:bookmarkEnd w:id="14"/>
-    <w:bookmarkStart w:id="15" w:name="X6531cdb28d141f59a1b7d10d18f1498a45f37a0"/>
+    <w:bookmarkEnd w:id="20"/>
+    <w:bookmarkStart w:id="21" w:name="X6531cdb28d141f59a1b7d10d18f1498a45f37a0"/>
     <w:p>
       <w:pPr>
         <w:pStyle w:val="Heading3"/>
@@ -570,8 +736,8 @@
         <w:t xml:space="preserve">assigning broad model-level blindness or bias scores.</w:t>
       </w:r>
     </w:p>
-    <w:bookmarkEnd w:id="15"/>
-    <w:bookmarkStart w:id="16" w:name="colour-attributes-and-object-grounding"/>
+    <w:bookmarkEnd w:id="21"/>
+    <w:bookmarkStart w:id="22" w:name="colour-attributes-and-object-grounding"/>
     <w:p>
       <w:pPr>
         <w:pStyle w:val="Heading3"/>
@@ -618,9 +784,9 @@
         <w:t xml:space="preserve">perception.</w:t>
       </w:r>
     </w:p>
-    <w:bookmarkEnd w:id="16"/>
-    <w:bookmarkEnd w:id="17"/>
-    <w:bookmarkStart w:id="22" w:name="task-and-evaluation-protocol"/>
+    <w:bookmarkEnd w:id="22"/>
+    <w:bookmarkEnd w:id="23"/>
+    <w:bookmarkStart w:id="28" w:name="task-and-evaluation-protocol"/>
     <w:p>
       <w:pPr>
         <w:pStyle w:val="Heading2"/>
@@ -629,7 +795,7 @@
         <w:t xml:space="preserve">3. Task and Evaluation Protocol</w:t>
       </w:r>
     </w:p>
-    <w:bookmarkStart w:id="18" w:name="task-definition"/>
+    <w:bookmarkStart w:id="24" w:name="task-definition"/>
     <w:p>
       <w:pPr>
         <w:pStyle w:val="Heading3"/>
@@ -705,8 +871,8 @@
         <w:t xml:space="preserve">keeps the interpretation tied to identical visual evidence.</w:t>
       </w:r>
     </w:p>
-    <w:bookmarkEnd w:id="18"/>
-    <w:bookmarkStart w:id="19" w:name="evaluation-set"/>
+    <w:bookmarkEnd w:id="24"/>
+    <w:bookmarkStart w:id="25" w:name="evaluation-set"/>
     <w:p>
       <w:pPr>
         <w:pStyle w:val="Heading3"/>
@@ -1181,8 +1347,8 @@
         </w:tc>
       </w:tr>
     </w:tbl>
-    <w:bookmarkEnd w:id="19"/>
-    <w:bookmarkStart w:id="20" w:name="models"/>
+    <w:bookmarkEnd w:id="25"/>
+    <w:bookmarkStart w:id="26" w:name="models"/>
     <w:p>
       <w:pPr>
         <w:pStyle w:val="Heading3"/>
@@ -1223,8 +1389,8 @@
         <w:t xml:space="preserve">prompts, and images.</w:t>
       </w:r>
     </w:p>
-    <w:bookmarkEnd w:id="20"/>
-    <w:bookmarkStart w:id="21" w:name="prompt-conditions-and-metrics"/>
+    <w:bookmarkEnd w:id="26"/>
+    <w:bookmarkStart w:id="27" w:name="prompt-conditions-and-metrics"/>
     <w:p>
       <w:pPr>
         <w:pStyle w:val="Heading3"/>
@@ -1594,9 +1760,9 @@
         </w:tc>
       </w:tr>
     </w:tbl>
-    <w:bookmarkEnd w:id="21"/>
-    <w:bookmarkEnd w:id="22"/>
-    <w:bookmarkStart w:id="39" w:name="results"/>
+    <w:bookmarkEnd w:id="27"/>
+    <w:bookmarkEnd w:id="28"/>
+    <w:bookmarkStart w:id="45" w:name="results"/>
     <w:p>
       <w:pPr>
         <w:pStyle w:val="Heading2"/>
@@ -1605,7 +1771,7 @@
         <w:t xml:space="preserve">4. Results</w:t>
       </w:r>
     </w:p>
-    <w:bookmarkStart w:id="23" w:name="Xd4754902de237fb40e9c75d1ba3e7b01ef36327"/>
+    <w:bookmarkStart w:id="29" w:name="Xd4754902de237fb40e9c75d1ba3e7b01ef36327"/>
     <w:p>
       <w:pPr>
         <w:pStyle w:val="Heading3"/>
@@ -2674,8 +2840,8 @@
         </w:tc>
       </w:tr>
     </w:tbl>
-    <w:bookmarkEnd w:id="23"/>
-    <w:bookmarkStart w:id="27" w:name="X559092dc33149abda0a5dac5965ed2fbbcd0b0d"/>
+    <w:bookmarkEnd w:id="29"/>
+    <w:bookmarkStart w:id="33" w:name="X559092dc33149abda0a5dac5965ed2fbbcd0b0d"/>
     <w:p>
       <w:pPr>
         <w:pStyle w:val="Heading3"/>
@@ -2745,18 +2911,18 @@
           <wp:inline>
             <wp:extent cx="3984280" cy="2793575"/>
             <wp:effectExtent b="0" l="0" r="0" t="0"/>
-            <wp:docPr descr="" title="" id="25" name="Picture"/>
+            <wp:docPr descr="" title="" id="31" name="Picture"/>
             <a:graphic>
               <a:graphicData uri="http://schemas.openxmlformats.org/drawingml/2006/picture">
                 <pic:pic>
                   <pic:nvPicPr>
-                    <pic:cNvPr descr="images/figure2_main_conflict_rates.png" id="26" name="Picture"/>
+                    <pic:cNvPr descr="images/figure2_main_conflict_rates.png" id="32" name="Picture"/>
                     <pic:cNvPicPr>
                       <a:picLocks noChangeArrowheads="1" noChangeAspect="1"/>
                     </pic:cNvPicPr>
                   </pic:nvPicPr>
                   <pic:blipFill>
-                    <a:blip r:embed="rId24"/>
+                    <a:blip r:embed="rId30"/>
                     <a:stretch>
                       <a:fillRect/>
                     </a:stretch>
@@ -2813,8 +2979,8 @@
         <w:t xml:space="preserve">labels mark counts out of 300.</w:t>
       </w:r>
     </w:p>
-    <w:bookmarkEnd w:id="27"/>
-    <w:bookmarkStart w:id="31" w:name="paired-flips-narrowed-the-attribution"/>
+    <w:bookmarkEnd w:id="33"/>
+    <w:bookmarkStart w:id="37" w:name="paired-flips-narrowed-the-attribution"/>
     <w:p>
       <w:pPr>
         <w:pStyle w:val="Heading3"/>
@@ -2890,18 +3056,18 @@
           <wp:inline>
             <wp:extent cx="4732287" cy="2978287"/>
             <wp:effectExtent b="0" l="0" r="0" t="0"/>
-            <wp:docPr descr="" title="" id="29" name="Picture"/>
+            <wp:docPr descr="" title="" id="35" name="Picture"/>
             <a:graphic>
               <a:graphicData uri="http://schemas.openxmlformats.org/drawingml/2006/picture">
                 <pic:pic>
                   <pic:nvPicPr>
-                    <pic:cNvPr descr="images/figure3_paired_flips.png" id="30" name="Picture"/>
+                    <pic:cNvPr descr="images/figure3_paired_flips.png" id="36" name="Picture"/>
                     <pic:cNvPicPr>
                       <a:picLocks noChangeArrowheads="1" noChangeAspect="1"/>
                     </pic:cNvPicPr>
                   </pic:nvPicPr>
                   <pic:blipFill>
-                    <a:blip r:embed="rId28"/>
+                    <a:blip r:embed="rId34"/>
                     <a:stretch>
                       <a:fillRect/>
                     </a:stretch>
@@ -2952,8 +3118,8 @@
         <w:t xml:space="preserve">images for which a model is faithful under C0 and false-colour-aligned under C1-C4.</w:t>
       </w:r>
     </w:p>
-    <w:bookmarkEnd w:id="31"/>
-    <w:bookmarkStart w:id="32" w:name="Xf1b91d66c6ab45192a19d2b4a082d724205f20c"/>
+    <w:bookmarkEnd w:id="37"/>
+    <w:bookmarkStart w:id="38" w:name="Xf1b91d66c6ab45192a19d2b4a082d724205f20c"/>
     <w:p>
       <w:pPr>
         <w:pStyle w:val="Heading3"/>
@@ -3026,8 +3192,8 @@
         <w:t xml:space="preserve">response space.</w:t>
       </w:r>
     </w:p>
-    <w:bookmarkEnd w:id="32"/>
-    <w:bookmarkStart w:id="36" w:name="Xb65aea865acc882181b05acea90af3c1bf3c8b9"/>
+    <w:bookmarkEnd w:id="38"/>
+    <w:bookmarkStart w:id="42" w:name="Xb65aea865acc882181b05acea90af3c1bf3c8b9"/>
     <w:p>
       <w:pPr>
         <w:pStyle w:val="Heading3"/>
@@ -3141,18 +3307,18 @@
           <wp:inline>
             <wp:extent cx="5334000" cy="3989065"/>
             <wp:effectExtent b="0" l="0" r="0" t="0"/>
-            <wp:docPr descr="" title="" id="34" name="Picture"/>
+            <wp:docPr descr="" title="" id="40" name="Picture"/>
             <a:graphic>
               <a:graphicData uri="http://schemas.openxmlformats.org/drawingml/2006/picture">
                 <pic:pic>
                   <pic:nvPicPr>
-                    <pic:cNvPr descr="images/figure4_boundary_diagnostics.png" id="35" name="Picture"/>
+                    <pic:cNvPr descr="images/figure4_boundary_diagnostics.png" id="41" name="Picture"/>
                     <pic:cNvPicPr>
                       <a:picLocks noChangeArrowheads="1" noChangeAspect="1"/>
                     </pic:cNvPicPr>
                   </pic:nvPicPr>
                   <pic:blipFill>
-                    <a:blip r:embed="rId33"/>
+                    <a:blip r:embed="rId39"/>
                     <a:stretch>
                       <a:fillRect/>
                     </a:stretch>
@@ -3215,8 +3381,8 @@
         <w:t xml:space="preserve">it.</w:t>
       </w:r>
     </w:p>
-    <w:bookmarkEnd w:id="36"/>
-    <w:bookmarkStart w:id="37" w:name="X7a3fb397faf82b760f4dc397e41ea77224a101e"/>
+    <w:bookmarkEnd w:id="42"/>
+    <w:bookmarkStart w:id="43" w:name="X7a3fb397faf82b760f4dc397e41ea77224a101e"/>
     <w:p>
       <w:pPr>
         <w:pStyle w:val="Heading3"/>
@@ -3325,8 +3491,8 @@
         <w:t xml:space="preserve">difference.</w:t>
       </w:r>
     </w:p>
-    <w:bookmarkEnd w:id="37"/>
-    <w:bookmarkStart w:id="38" w:name="X115a4772a3d2529d589de1999b3a185c1910969"/>
+    <w:bookmarkEnd w:id="43"/>
+    <w:bookmarkStart w:id="44" w:name="X115a4772a3d2529d589de1999b3a185c1910969"/>
     <w:p>
       <w:pPr>
         <w:pStyle w:val="Heading3"/>
@@ -3367,9 +3533,9 @@
         <w:t xml:space="preserve">It should not be used to reinterpret the single-turn C0-C4 result.</w:t>
       </w:r>
     </w:p>
-    <w:bookmarkEnd w:id="38"/>
-    <w:bookmarkEnd w:id="39"/>
-    <w:bookmarkStart w:id="40" w:name="discussion"/>
+    <w:bookmarkEnd w:id="44"/>
+    <w:bookmarkEnd w:id="45"/>
+    <w:bookmarkStart w:id="49" w:name="discussion"/>
     <w:p>
       <w:pPr>
         <w:pStyle w:val="Heading2"/>
@@ -3485,6 +3651,89 @@
         <w:pStyle w:val="BodyText"/>
       </w:pPr>
       <w:r>
+        <w:drawing>
+          <wp:inline>
+            <wp:extent cx="5334000" cy="2637033"/>
+            <wp:effectExtent b="0" l="0" r="0" t="0"/>
+            <wp:docPr descr="" title="" id="47" name="Picture"/>
+            <a:graphic>
+              <a:graphicData uri="http://schemas.openxmlformats.org/drawingml/2006/picture">
+                <pic:pic>
+                  <pic:nvPicPr>
+                    <pic:cNvPr descr="images/claim_boundary_summary.png" id="48" name="Picture"/>
+                    <pic:cNvPicPr>
+                      <a:picLocks noChangeArrowheads="1" noChangeAspect="1"/>
+                    </pic:cNvPicPr>
+                  </pic:nvPicPr>
+                  <pic:blipFill>
+                    <a:blip r:embed="rId46"/>
+                    <a:stretch>
+                      <a:fillRect/>
+                    </a:stretch>
+                  </pic:blipFill>
+                  <pic:spPr bwMode="auto">
+                    <a:xfrm>
+                      <a:off x="0" y="0"/>
+                      <a:ext cx="5334000" cy="2637033"/>
+                    </a:xfrm>
+                    <a:prstGeom prst="rect">
+                      <a:avLst/>
+                    </a:prstGeom>
+                    <a:noFill/>
+                    <a:ln w="9525">
+                      <a:noFill/>
+                      <a:headEnd/>
+                      <a:tailEnd/>
+                    </a:ln>
+                  </pic:spPr>
+                </pic:pic>
+              </a:graphicData>
+            </a:graphic>
+          </wp:inline>
+        </w:drawing>
+      </w:r>
+    </w:p>
+    <w:p>
+      <w:pPr>
+        <w:pStyle w:val="BodyText"/>
+      </w:pPr>
+      <w:r>
+        <w:rPr>
+          <w:b/>
+          <w:bCs/>
+        </w:rPr>
+        <w:t xml:space="preserve">Claim boundary guide. Supported, bounded, and not claimed.</w:t>
+      </w:r>
+      <w:r>
+        <w:t xml:space="preserve"> </w:t>
+      </w:r>
+      <w:r>
+        <w:t xml:space="preserve">The guide restates the</w:t>
+      </w:r>
+      <w:r>
+        <w:t xml:space="preserve"> </w:t>
+      </w:r>
+      <w:r>
+        <w:t xml:space="preserve">interpretive boundary of the study: C0 faithfulness and LLaVA C3/C4 paired shifts are</w:t>
+      </w:r>
+      <w:r>
+        <w:t xml:space="preserve"> </w:t>
+      </w:r>
+      <w:r>
+        <w:t xml:space="preserve">supported, prompt and colour-pair dependence bounds the conclusion, and the evidence</w:t>
+      </w:r>
+      <w:r>
+        <w:t xml:space="preserve"> </w:t>
+      </w:r>
+      <w:r>
+        <w:t xml:space="preserve">does not support a general text-over-vision claim.</w:t>
+      </w:r>
+    </w:p>
+    <w:p>
+      <w:pPr>
+        <w:pStyle w:val="BodyText"/>
+      </w:pPr>
+      <w:r>
         <w:t xml:space="preserve">The main value of the study is methodological as much as numerical. It separates the</w:t>
       </w:r>
       <w:r>
@@ -3506,8 +3755,8 @@
         <w:t xml:space="preserve">way to judge what the evidence supports and where it stops.</w:t>
       </w:r>
     </w:p>
-    <w:bookmarkEnd w:id="40"/>
-    <w:bookmarkStart w:id="41" w:name="limitations"/>
+    <w:bookmarkEnd w:id="49"/>
+    <w:bookmarkStart w:id="50" w:name="limitations"/>
     <w:p>
       <w:pPr>
         <w:pStyle w:val="Heading2"/>
@@ -3640,8 +3889,8 @@
         <w:t xml:space="preserve">specific local claim.</w:t>
       </w:r>
     </w:p>
-    <w:bookmarkEnd w:id="41"/>
-    <w:bookmarkStart w:id="42" w:name="conclusion"/>
+    <w:bookmarkEnd w:id="50"/>
+    <w:bookmarkStart w:id="51" w:name="conclusion"/>
     <w:p>
       <w:pPr>
         <w:pStyle w:val="Heading2"/>
@@ -3712,8 +3961,8 @@
         <w:t xml:space="preserve">settings, but the evidence does not support a general text-over-vision claim.</w:t>
       </w:r>
     </w:p>
-    <w:bookmarkEnd w:id="42"/>
-    <w:bookmarkStart w:id="43" w:name="data-availability"/>
+    <w:bookmarkEnd w:id="51"/>
+    <w:bookmarkStart w:id="52" w:name="data-availability"/>
     <w:p>
       <w:pPr>
         <w:pStyle w:val="Heading2"/>
@@ -3846,8 +4095,8 @@
         <w:t xml:space="preserve">original third-party image collections.</w:t>
       </w:r>
     </w:p>
-    <w:bookmarkEnd w:id="43"/>
-    <w:bookmarkStart w:id="44" w:name="code-availability"/>
+    <w:bookmarkEnd w:id="52"/>
+    <w:bookmarkStart w:id="53" w:name="code-availability"/>
     <w:p>
       <w:pPr>
         <w:pStyle w:val="Heading2"/>
@@ -3930,8 +4179,8 @@
         <w:t xml:space="preserve">providers.</w:t>
       </w:r>
     </w:p>
-    <w:bookmarkEnd w:id="44"/>
-    <w:bookmarkEnd w:id="45"/>
+    <w:bookmarkEnd w:id="53"/>
+    <w:bookmarkEnd w:id="54"/>
     <w:sectPr>
       <w:footnotePr>
         <w:numRestart w:val="eachSect"/>

</xml_diff>

<commit_message>
Redesign graphical overview layout
</commit_message>
<xml_diff>
--- a/deliverables/conference_submission_draft/conference_manuscript_with_figures.docx
+++ b/deliverables/conference_submission_draft/conference_manuscript_with_figures.docx
@@ -389,7 +389,7 @@
       <w:r>
         <w:drawing>
           <wp:inline>
-            <wp:extent cx="5334000" cy="3459691"/>
+            <wp:extent cx="5334000" cy="3193163"/>
             <wp:effectExtent b="0" l="0" r="0" t="0"/>
             <wp:docPr descr="" title="" id="11" name="Picture"/>
             <a:graphic>
@@ -410,7 +410,7 @@
                   <pic:spPr bwMode="auto">
                     <a:xfrm>
                       <a:off x="0" y="0"/>
-                      <a:ext cx="5334000" cy="3459691"/>
+                      <a:ext cx="5334000" cy="3193163"/>
                     </a:xfrm>
                     <a:prstGeom prst="rect">
                       <a:avLst/>

</xml_diff>

<commit_message>
Polish narrative figure integration
</commit_message>
<xml_diff>
--- a/deliverables/conference_submission_draft/conference_manuscript_with_figures.docx
+++ b/deliverables/conference_submission_draft/conference_manuscript_with_figures.docx
@@ -444,31 +444,31 @@
         <w:t xml:space="preserve"> </w:t>
       </w:r>
       <w:r>
-        <w:t xml:space="preserve">This illustrative panel uses one</w:t>
-      </w:r>
-      <w:r>
-        <w:t xml:space="preserve"> </w:t>
-      </w:r>
-      <w:r>
-        <w:t xml:space="preserve">actual paired LLaVA example to show the experimental unit: the same image is evaluated</w:t>
-      </w:r>
-      <w:r>
-        <w:t xml:space="preserve"> </w:t>
-      </w:r>
-      <w:r>
-        <w:t xml:space="preserve">with the neutral C0 prompt and the false-colour C3 prompt, and the parsed answer changes</w:t>
-      </w:r>
-      <w:r>
-        <w:t xml:space="preserve"> </w:t>
-      </w:r>
-      <w:r>
-        <w:t xml:space="preserve">from the true colour to the embedded false cue. The panel is a reader aid rather than</w:t>
-      </w:r>
-      <w:r>
-        <w:t xml:space="preserve"> </w:t>
-      </w:r>
-      <w:r>
-        <w:t xml:space="preserve">primary evidence.</w:t>
+        <w:t xml:space="preserve">One audited LLaVA paired case</w:t>
+      </w:r>
+      <w:r>
+        <w:t xml:space="preserve"> </w:t>
+      </w:r>
+      <w:r>
+        <w:t xml:space="preserve">illustrates the experimental unit: the same image is evaluated with the neutral C0</w:t>
+      </w:r>
+      <w:r>
+        <w:t xml:space="preserve"> </w:t>
+      </w:r>
+      <w:r>
+        <w:t xml:space="preserve">prompt and the false-colour C3 prompt, and the parsed answer changes from the true</w:t>
+      </w:r>
+      <w:r>
+        <w:t xml:space="preserve"> </w:t>
+      </w:r>
+      <w:r>
+        <w:t xml:space="preserve">colour to the embedded false cue. The panel is illustrative; the aggregate claim is</w:t>
+      </w:r>
+      <w:r>
+        <w:t xml:space="preserve"> </w:t>
+      </w:r>
+      <w:r>
+        <w:t xml:space="preserve">supported by the full C0-C4 results and diagnostics.</w:t>
       </w:r>
     </w:p>
     <w:p>
@@ -527,25 +527,31 @@
           <w:b/>
           <w:bCs/>
         </w:rPr>
-        <w:t xml:space="preserve">Reader map. Argument path of the manuscript.</w:t>
-      </w:r>
-      <w:r>
-        <w:t xml:space="preserve"> </w:t>
-      </w:r>
-      <w:r>
-        <w:t xml:space="preserve">This visual guide summarises the paper’s</w:t>
-      </w:r>
-      <w:r>
-        <w:t xml:space="preserve"> </w:t>
-      </w:r>
-      <w:r>
-        <w:t xml:space="preserve">logic from question, paired evidence, and observed shift to diagnostics, validity checks,</w:t>
-      </w:r>
-      <w:r>
-        <w:t xml:space="preserve"> </w:t>
-      </w:r>
-      <w:r>
-        <w:t xml:space="preserve">and a bounded claim. It is intended to orient the reader before the quantitative figures.</w:t>
+        <w:t xml:space="preserve">Argument map. Narrative structure of the manuscript.</w:t>
+      </w:r>
+      <w:r>
+        <w:t xml:space="preserve"> </w:t>
+      </w:r>
+      <w:r>
+        <w:t xml:space="preserve">This guide summarises the</w:t>
+      </w:r>
+      <w:r>
+        <w:t xml:space="preserve"> </w:t>
+      </w:r>
+      <w:r>
+        <w:t xml:space="preserve">paper’s logic from question, paired evidence, and observed shift to diagnostics,</w:t>
+      </w:r>
+      <w:r>
+        <w:t xml:space="preserve"> </w:t>
+      </w:r>
+      <w:r>
+        <w:t xml:space="preserve">validity checks, and a bounded claim. It is included to orient the reader before the</w:t>
+      </w:r>
+      <w:r>
+        <w:t xml:space="preserve"> </w:t>
+      </w:r>
+      <w:r>
+        <w:t xml:space="preserve">quantitative figures.</w:t>
       </w:r>
     </w:p>
     <w:p>
@@ -3702,13 +3708,13 @@
           <w:b/>
           <w:bCs/>
         </w:rPr>
-        <w:t xml:space="preserve">Claim boundary guide. Supported, bounded, and not claimed.</w:t>
-      </w:r>
-      <w:r>
-        <w:t xml:space="preserve"> </w:t>
-      </w:r>
-      <w:r>
-        <w:t xml:space="preserve">The guide restates the</w:t>
+        <w:t xml:space="preserve">Claim-boundary guide. Supported, bounded, and not claimed.</w:t>
+      </w:r>
+      <w:r>
+        <w:t xml:space="preserve"> </w:t>
+      </w:r>
+      <w:r>
+        <w:t xml:space="preserve">This guide restates the</w:t>
       </w:r>
       <w:r>
         <w:t xml:space="preserve"> </w:t>
@@ -3720,13 +3726,13 @@
         <w:t xml:space="preserve"> </w:t>
       </w:r>
       <w:r>
-        <w:t xml:space="preserve">supported, prompt and colour-pair dependence bounds the conclusion, and the evidence</w:t>
-      </w:r>
-      <w:r>
-        <w:t xml:space="preserve"> </w:t>
-      </w:r>
-      <w:r>
-        <w:t xml:space="preserve">does not support a general text-over-vision claim.</w:t>
+        <w:t xml:space="preserve">supported, prompt and colour-pair dependence bound the conclusion, and the evidence does</w:t>
+      </w:r>
+      <w:r>
+        <w:t xml:space="preserve"> </w:t>
+      </w:r>
+      <w:r>
+        <w:t xml:space="preserve">not support a general text-over-vision claim.</w:t>
       </w:r>
     </w:p>
     <w:p>

</xml_diff>

<commit_message>
Rework conference manuscript format
</commit_message>
<xml_diff>
--- a/deliverables/conference_submission_draft/conference_manuscript_with_figures.docx
+++ b/deliverables/conference_submission_draft/conference_manuscript_with_figures.docx
@@ -10,7 +10,7 @@
         <w:t xml:space="preserve">False Colour Cues Reveal Local Paired Shifts in Car-Colour VLMs</w:t>
       </w:r>
     </w:p>
-    <w:bookmarkStart w:id="54" w:name="X36981489e51d4ab08f511a328bdbf275c003766"/>
+    <w:bookmarkStart w:id="52" w:name="X36981489e51d4ab08f511a328bdbf275c003766"/>
     <w:p>
       <w:pPr>
         <w:pStyle w:val="Heading1"/>
@@ -57,25 +57,31 @@
         <w:t xml:space="preserve"> </w:t>
       </w:r>
       <w:r>
-        <w:t xml:space="preserve">output parsing. We study this attribution problem in a deliberately narrow setting:</w:t>
-      </w:r>
-      <w:r>
-        <w:t xml:space="preserve"> </w:t>
-      </w:r>
-      <w:r>
-        <w:t xml:space="preserve">primary car-body colour recognition with false textual colour cues. Using a balanced</w:t>
-      </w:r>
-      <w:r>
-        <w:t xml:space="preserve"> </w:t>
-      </w:r>
-      <w:r>
-        <w:t xml:space="preserve">300-image car set over six colours, we evaluate LLaVA-1.5-7B, Qwen2-VL-7B-Instruct, and</w:t>
-      </w:r>
-      <w:r>
-        <w:t xml:space="preserve"> </w:t>
-      </w:r>
-      <w:r>
-        <w:t xml:space="preserve">InternVL2-8B under a neutral C0 prompt and four single-turn conflict prompts, C1-C4. All</w:t>
+        <w:t xml:space="preserve">output parsing. This study examines this attribution problem in a deliberately narrow</w:t>
+      </w:r>
+      <w:r>
+        <w:t xml:space="preserve"> </w:t>
+      </w:r>
+      <w:r>
+        <w:t xml:space="preserve">setting: primary car-body colour recognition with false textual colour cues. The</w:t>
+      </w:r>
+      <w:r>
+        <w:t xml:space="preserve"> </w:t>
+      </w:r>
+      <w:r>
+        <w:t xml:space="preserve">protocol uses a balanced 300-image car set over six colours to evaluate LLaVA-1.5-7B,</w:t>
+      </w:r>
+      <w:r>
+        <w:t xml:space="preserve"> </w:t>
+      </w:r>
+      <w:r>
+        <w:t xml:space="preserve">Qwen2-VL-7B-Instruct, and InternVL2-8B under a neutral C0 prompt and four single-turn</w:t>
+      </w:r>
+      <w:r>
+        <w:t xml:space="preserve"> </w:t>
+      </w:r>
+      <w:r>
+        <w:t xml:space="preserve">conflict prompts, C1-C4. All</w:t>
       </w:r>
       <w:r>
         <w:t xml:space="preserve"> </w:t>
@@ -133,7 +139,7 @@
       </w:r>
     </w:p>
     <w:bookmarkEnd w:id="9"/>
-    <w:bookmarkStart w:id="19" w:name="introduction"/>
+    <w:bookmarkStart w:id="16" w:name="introduction"/>
     <w:p>
       <w:pPr>
         <w:pStyle w:val="Heading2"/>
@@ -153,19 +159,13 @@
         <w:t xml:space="preserve"> </w:t>
       </w:r>
       <w:r>
-        <w:t xml:space="preserve">language instructions, descriptions, or contextual claims [Radford2021CLIP;</w:t>
-      </w:r>
-      <w:r>
-        <w:t xml:space="preserve"> </w:t>
-      </w:r>
-      <w:r>
-        <w:t xml:space="preserve">Alayrac2022Flamingo; Li2023BLIP2; Liu2023VisualInstruction; Liu2023Improved]. This</w:t>
-      </w:r>
-      <w:r>
-        <w:t xml:space="preserve"> </w:t>
-      </w:r>
-      <w:r>
-        <w:t xml:space="preserve">joint interface creates a reliability question that is easy to pose but hard to</w:t>
+        <w:t xml:space="preserve">language instructions, descriptions, or contextual claims [1-5]. This joint interface</w:t>
+      </w:r>
+      <w:r>
+        <w:t xml:space="preserve"> </w:t>
+      </w:r>
+      <w:r>
+        <w:t xml:space="preserve">creates a reliability question that is easy to pose but hard to</w:t>
       </w:r>
       <w:r>
         <w:t xml:space="preserve"> </w:t>
@@ -209,25 +209,13 @@
         <w:t xml:space="preserve"> </w:t>
       </w:r>
       <w:r>
-        <w:t xml:space="preserve">visible [Goyal2017VQAv2; Agrawal2018DontAssume; Li2023POPE; Guan2023HallusionBench;</w:t>
-      </w:r>
-      <w:r>
-        <w:t xml:space="preserve"> </w:t>
-      </w:r>
-      <w:r>
-        <w:t xml:space="preserve">Lee2024VLindBench; Liang2025ColorBench; Yuksekgonul2023ARO; Thrush2022Winoground]. Yet</w:t>
-      </w:r>
-      <w:r>
-        <w:t xml:space="preserve"> </w:t>
-      </w:r>
-      <w:r>
-        <w:t xml:space="preserve">broad tasks, open-ended outputs, and changing image pools can make the source of a</w:t>
-      </w:r>
-      <w:r>
-        <w:t xml:space="preserve"> </w:t>
-      </w:r>
-      <w:r>
-        <w:t xml:space="preserve">conflict error difficult to isolate.</w:t>
+        <w:t xml:space="preserve">visible [6-13]. Yet broad tasks, open-ended outputs, and changing image pools can make</w:t>
+      </w:r>
+      <w:r>
+        <w:t xml:space="preserve"> </w:t>
+      </w:r>
+      <w:r>
+        <w:t xml:space="preserve">the source of a conflict error difficult to isolate.</w:t>
       </w:r>
     </w:p>
     <w:p>
@@ -235,7 +223,13 @@
         <w:pStyle w:val="BodyText"/>
       </w:pPr>
       <w:r>
-        <w:t xml:space="preserve">This paper examines a smaller question with a shorter evidence chain. We ask whether a</w:t>
+        <w:t xml:space="preserve">This paper examines a smaller question with a shorter evidence chain. The central</w:t>
+      </w:r>
+      <w:r>
+        <w:t xml:space="preserve"> </w:t>
+      </w:r>
+      <w:r>
+        <w:t xml:space="preserve">question is whether a</w:t>
       </w:r>
       <w:r>
         <w:t xml:space="preserve"> </w:t>
@@ -273,13 +267,13 @@
         <w:pStyle w:val="BodyText"/>
       </w:pPr>
       <w:r>
-        <w:t xml:space="preserve">We evaluate three fixed VLM checkpoints on a balanced 300-image, six-colour car-image</w:t>
-      </w:r>
-      <w:r>
-        <w:t xml:space="preserve"> </w:t>
-      </w:r>
-      <w:r>
-        <w:t xml:space="preserve">set. The primary protocol compares a neutral C0 prompt with four single-turn conflict</w:t>
+        <w:t xml:space="preserve">The evaluation uses three fixed VLM checkpoints on a balanced 300-image, six-colour</w:t>
+      </w:r>
+      <w:r>
+        <w:t xml:space="preserve"> </w:t>
+      </w:r>
+      <w:r>
+        <w:t xml:space="preserve">car-image set. The primary protocol compares a neutral C0 prompt with four single-turn conflict</w:t>
       </w:r>
       <w:r>
         <w:t xml:space="preserve"> </w:t>
@@ -478,103 +472,20 @@
       <w:r>
         <w:drawing>
           <wp:inline>
-            <wp:extent cx="5334000" cy="2299137"/>
+            <wp:extent cx="5334000" cy="1636355"/>
             <wp:effectExtent b="0" l="0" r="0" t="0"/>
             <wp:docPr descr="" title="" id="14" name="Picture"/>
             <a:graphic>
               <a:graphicData uri="http://schemas.openxmlformats.org/drawingml/2006/picture">
                 <pic:pic>
                   <pic:nvPicPr>
-                    <pic:cNvPr descr="images/manuscript_argument_roadmap.png" id="15" name="Picture"/>
+                    <pic:cNvPr descr="images/figure1_evidence_chain.png" id="15" name="Picture"/>
                     <pic:cNvPicPr>
                       <a:picLocks noChangeArrowheads="1" noChangeAspect="1"/>
                     </pic:cNvPicPr>
                   </pic:nvPicPr>
                   <pic:blipFill>
                     <a:blip r:embed="rId13"/>
-                    <a:stretch>
-                      <a:fillRect/>
-                    </a:stretch>
-                  </pic:blipFill>
-                  <pic:spPr bwMode="auto">
-                    <a:xfrm>
-                      <a:off x="0" y="0"/>
-                      <a:ext cx="5334000" cy="2299137"/>
-                    </a:xfrm>
-                    <a:prstGeom prst="rect">
-                      <a:avLst/>
-                    </a:prstGeom>
-                    <a:noFill/>
-                    <a:ln w="9525">
-                      <a:noFill/>
-                      <a:headEnd/>
-                      <a:tailEnd/>
-                    </a:ln>
-                  </pic:spPr>
-                </pic:pic>
-              </a:graphicData>
-            </a:graphic>
-          </wp:inline>
-        </w:drawing>
-      </w:r>
-    </w:p>
-    <w:p>
-      <w:pPr>
-        <w:pStyle w:val="BodyText"/>
-      </w:pPr>
-      <w:r>
-        <w:rPr>
-          <w:b/>
-          <w:bCs/>
-        </w:rPr>
-        <w:t xml:space="preserve">Argument map. Narrative structure of the manuscript.</w:t>
-      </w:r>
-      <w:r>
-        <w:t xml:space="preserve"> </w:t>
-      </w:r>
-      <w:r>
-        <w:t xml:space="preserve">This guide summarises the</w:t>
-      </w:r>
-      <w:r>
-        <w:t xml:space="preserve"> </w:t>
-      </w:r>
-      <w:r>
-        <w:t xml:space="preserve">paper’s logic from question, paired evidence, and observed shift to diagnostics,</w:t>
-      </w:r>
-      <w:r>
-        <w:t xml:space="preserve"> </w:t>
-      </w:r>
-      <w:r>
-        <w:t xml:space="preserve">validity checks, and a bounded claim. It is included to orient the reader before the</w:t>
-      </w:r>
-      <w:r>
-        <w:t xml:space="preserve"> </w:t>
-      </w:r>
-      <w:r>
-        <w:t xml:space="preserve">quantitative figures.</w:t>
-      </w:r>
-    </w:p>
-    <w:p>
-      <w:pPr>
-        <w:pStyle w:val="BodyText"/>
-      </w:pPr>
-      <w:r>
-        <w:drawing>
-          <wp:inline>
-            <wp:extent cx="5334000" cy="1636355"/>
-            <wp:effectExtent b="0" l="0" r="0" t="0"/>
-            <wp:docPr descr="" title="" id="17" name="Picture"/>
-            <a:graphic>
-              <a:graphicData uri="http://schemas.openxmlformats.org/drawingml/2006/picture">
-                <pic:pic>
-                  <pic:nvPicPr>
-                    <pic:cNvPr descr="images/figure1_evidence_chain.png" id="18" name="Picture"/>
-                    <pic:cNvPicPr>
-                      <a:picLocks noChangeArrowheads="1" noChangeAspect="1"/>
-                    </pic:cNvPicPr>
-                  </pic:nvPicPr>
-                  <pic:blipFill>
-                    <a:blip r:embed="rId16"/>
                     <a:stretch>
                       <a:fillRect/>
                     </a:stretch>
@@ -631,177 +542,171 @@
         <w:t xml:space="preserve">prompts, paired flip definition, and boundary diagnostics.</w:t>
       </w:r>
     </w:p>
+    <w:bookmarkEnd w:id="16"/>
+    <w:bookmarkStart w:id="20" w:name="related-work"/>
+    <w:p>
+      <w:pPr>
+        <w:pStyle w:val="Heading2"/>
+      </w:pPr>
+      <w:r>
+        <w:t xml:space="preserve">2. Related Work</w:t>
+      </w:r>
+    </w:p>
+    <w:bookmarkStart w:id="17" w:name="X859a692aaf4fcdd5703774225666d1b9d51cb87"/>
+    <w:p>
+      <w:pPr>
+        <w:pStyle w:val="Heading3"/>
+      </w:pPr>
+      <w:r>
+        <w:t xml:space="preserve">Multimodal conflict and hallucination evaluation</w:t>
+      </w:r>
+    </w:p>
+    <w:p>
+      <w:pPr>
+        <w:pStyle w:val="FirstParagraph"/>
+      </w:pPr>
+      <w:r>
+        <w:t xml:space="preserve">Multimodal hallucination and conflict benchmarks test whether model outputs remain</w:t>
+      </w:r>
+      <w:r>
+        <w:t xml:space="preserve"> </w:t>
+      </w:r>
+      <w:r>
+        <w:t xml:space="preserve">grounded when visual evidence, textual context, or world knowledge are unreliable</w:t>
+      </w:r>
+      <w:r>
+        <w:t xml:space="preserve"> </w:t>
+      </w:r>
+      <w:r>
+        <w:t xml:space="preserve">[8-10]. These benchmarks motivate controlled conflict evaluation, but many cover broad</w:t>
+      </w:r>
+      <w:r>
+        <w:t xml:space="preserve"> </w:t>
+      </w:r>
+      <w:r>
+        <w:t xml:space="preserve">question types, object categories, or free-form outputs. The present study differs by narrowing the task to one visual attribute</w:t>
+      </w:r>
+      <w:r>
+        <w:t xml:space="preserve"> </w:t>
+      </w:r>
+      <w:r>
+        <w:t xml:space="preserve">and by treating same-image paired flips as the primary evidence unit.</w:t>
+      </w:r>
+    </w:p>
+    <w:bookmarkEnd w:id="17"/>
+    <w:bookmarkStart w:id="18" w:name="X6531cdb28d141f59a1b7d10d18f1498a45f37a0"/>
+    <w:p>
+      <w:pPr>
+        <w:pStyle w:val="Heading3"/>
+      </w:pPr>
+      <w:r>
+        <w:t xml:space="preserve">Language priors and diagnostic separation</w:t>
+      </w:r>
+    </w:p>
+    <w:p>
+      <w:pPr>
+        <w:pStyle w:val="FirstParagraph"/>
+      </w:pPr>
+      <w:r>
+        <w:t xml:space="preserve">Language priors can produce plausible answers without adequate visual grounding</w:t>
+      </w:r>
+      <w:r>
+        <w:t xml:space="preserve"> </w:t>
+      </w:r>
+      <w:r>
+        <w:t xml:space="preserve">[6,7]. However, a false-text-aligned answer is not</w:t>
+      </w:r>
+      <w:r>
+        <w:t xml:space="preserve"> </w:t>
+      </w:r>
+      <w:r>
+        <w:t xml:space="preserve">automatically a pure language-prior effect. It can also reflect image visibility,</w:t>
+      </w:r>
+      <w:r>
+        <w:t xml:space="preserve"> </w:t>
+      </w:r>
+      <w:r>
+        <w:t xml:space="preserve">ambiguous labels, prompt format, or parser behaviour. Recent diagnostic work has</w:t>
+      </w:r>
+      <w:r>
+        <w:t xml:space="preserve"> </w:t>
+      </w:r>
+      <w:r>
+        <w:t xml:space="preserve">therefore emphasised separating perception, knowledge, bias, and response-format effects</w:t>
+      </w:r>
+      <w:r>
+        <w:t xml:space="preserve"> </w:t>
+      </w:r>
+      <w:r>
+        <w:t xml:space="preserve">[10]. This separation is adopted here as an evaluation principle, without</w:t>
+      </w:r>
+      <w:r>
+        <w:t xml:space="preserve"> </w:t>
+      </w:r>
+      <w:r>
+        <w:t xml:space="preserve">assigning broad model-level blindness or bias scores.</w:t>
+      </w:r>
+    </w:p>
+    <w:bookmarkEnd w:id="18"/>
+    <w:bookmarkStart w:id="19" w:name="colour-attributes-and-object-grounding"/>
+    <w:p>
+      <w:pPr>
+        <w:pStyle w:val="Heading3"/>
+      </w:pPr>
+      <w:r>
+        <w:t xml:space="preserve">Colour, attributes, and object grounding</w:t>
+      </w:r>
+    </w:p>
+    <w:p>
+      <w:pPr>
+        <w:pStyle w:val="FirstParagraph"/>
+      </w:pPr>
+      <w:r>
+        <w:t xml:space="preserve">Colour is interpretable, but it is not a trivial probe. Benchmarks on colour</w:t>
+      </w:r>
+      <w:r>
+        <w:t xml:space="preserve"> </w:t>
+      </w:r>
+      <w:r>
+        <w:t xml:space="preserve">understanding, compositionality, and attribute binding show that VLM behaviour can vary</w:t>
+      </w:r>
+      <w:r>
+        <w:t xml:space="preserve"> </w:t>
+      </w:r>
+      <w:r>
+        <w:t xml:space="preserve">with object category, colour distribution, visual ambiguity, and prompt form</w:t>
+      </w:r>
+      <w:r>
+        <w:t xml:space="preserve"> </w:t>
+      </w:r>
+      <w:r>
+        <w:t xml:space="preserve">[11-13]. Car-body colour is used</w:t>
+      </w:r>
+      <w:r>
+        <w:t xml:space="preserve"> </w:t>
+      </w:r>
+      <w:r>
+        <w:t xml:space="preserve">as a controlled observation window rather than as a claim about general colour</w:t>
+      </w:r>
+      <w:r>
+        <w:t xml:space="preserve"> </w:t>
+      </w:r>
+      <w:r>
+        <w:t xml:space="preserve">perception.</w:t>
+      </w:r>
+    </w:p>
     <w:bookmarkEnd w:id="19"/>
-    <w:bookmarkStart w:id="23" w:name="related-work"/>
+    <w:bookmarkEnd w:id="20"/>
+    <w:bookmarkStart w:id="25" w:name="task-and-evaluation-protocol"/>
     <w:p>
       <w:pPr>
         <w:pStyle w:val="Heading2"/>
       </w:pPr>
       <w:r>
-        <w:t xml:space="preserve">2. Related Work</w:t>
-      </w:r>
-    </w:p>
-    <w:bookmarkStart w:id="20" w:name="X859a692aaf4fcdd5703774225666d1b9d51cb87"/>
-    <w:p>
-      <w:pPr>
-        <w:pStyle w:val="Heading3"/>
-      </w:pPr>
-      <w:r>
-        <w:t xml:space="preserve">Multimodal conflict and hallucination evaluation</w:t>
-      </w:r>
-    </w:p>
-    <w:p>
-      <w:pPr>
-        <w:pStyle w:val="FirstParagraph"/>
-      </w:pPr>
-      <w:r>
-        <w:t xml:space="preserve">Multimodal hallucination and conflict benchmarks test whether model outputs remain</w:t>
-      </w:r>
-      <w:r>
-        <w:t xml:space="preserve"> </w:t>
-      </w:r>
-      <w:r>
-        <w:t xml:space="preserve">grounded when visual evidence, textual context, or world knowledge are unreliable</w:t>
-      </w:r>
-      <w:r>
-        <w:t xml:space="preserve"> </w:t>
-      </w:r>
-      <w:r>
-        <w:t xml:space="preserve">[Li2023POPE; Guan2023HallusionBench; Lee2024VLindBench]. These benchmarks motivate</w:t>
-      </w:r>
-      <w:r>
-        <w:t xml:space="preserve"> </w:t>
-      </w:r>
-      <w:r>
-        <w:t xml:space="preserve">controlled conflict evaluation, but many cover broad question types, object categories,</w:t>
-      </w:r>
-      <w:r>
-        <w:t xml:space="preserve"> </w:t>
-      </w:r>
-      <w:r>
-        <w:t xml:space="preserve">or free-form outputs. Our study differs by narrowing the task to one visual attribute</w:t>
-      </w:r>
-      <w:r>
-        <w:t xml:space="preserve"> </w:t>
-      </w:r>
-      <w:r>
-        <w:t xml:space="preserve">and by treating same-image paired flips as the primary evidence unit.</w:t>
-      </w:r>
-    </w:p>
-    <w:bookmarkEnd w:id="20"/>
-    <w:bookmarkStart w:id="21" w:name="X6531cdb28d141f59a1b7d10d18f1498a45f37a0"/>
-    <w:p>
-      <w:pPr>
-        <w:pStyle w:val="Heading3"/>
-      </w:pPr>
-      <w:r>
-        <w:t xml:space="preserve">Language priors and diagnostic separation</w:t>
-      </w:r>
-    </w:p>
-    <w:p>
-      <w:pPr>
-        <w:pStyle w:val="FirstParagraph"/>
-      </w:pPr>
-      <w:r>
-        <w:t xml:space="preserve">Language priors can produce plausible answers without adequate visual grounding</w:t>
-      </w:r>
-      <w:r>
-        <w:t xml:space="preserve"> </w:t>
-      </w:r>
-      <w:r>
-        <w:t xml:space="preserve">[Goyal2017VQAv2; Agrawal2018DontAssume]. However, a false-text-aligned answer is not</w:t>
-      </w:r>
-      <w:r>
-        <w:t xml:space="preserve"> </w:t>
-      </w:r>
-      <w:r>
-        <w:t xml:space="preserve">automatically a pure language-prior effect. It can also reflect image visibility,</w:t>
-      </w:r>
-      <w:r>
-        <w:t xml:space="preserve"> </w:t>
-      </w:r>
-      <w:r>
-        <w:t xml:space="preserve">ambiguous labels, prompt format, or parser behaviour. Recent diagnostic work has</w:t>
-      </w:r>
-      <w:r>
-        <w:t xml:space="preserve"> </w:t>
-      </w:r>
-      <w:r>
-        <w:t xml:space="preserve">therefore emphasised separating perception, knowledge, bias, and response-format effects</w:t>
-      </w:r>
-      <w:r>
-        <w:t xml:space="preserve"> </w:t>
-      </w:r>
-      <w:r>
-        <w:t xml:space="preserve">[Lee2024VLindBench]. We adopt this separation as an evaluation principle, without</w:t>
-      </w:r>
-      <w:r>
-        <w:t xml:space="preserve"> </w:t>
-      </w:r>
-      <w:r>
-        <w:t xml:space="preserve">assigning broad model-level blindness or bias scores.</w:t>
-      </w:r>
-    </w:p>
-    <w:bookmarkEnd w:id="21"/>
-    <w:bookmarkStart w:id="22" w:name="colour-attributes-and-object-grounding"/>
-    <w:p>
-      <w:pPr>
-        <w:pStyle w:val="Heading3"/>
-      </w:pPr>
-      <w:r>
-        <w:t xml:space="preserve">Colour, attributes, and object grounding</w:t>
-      </w:r>
-    </w:p>
-    <w:p>
-      <w:pPr>
-        <w:pStyle w:val="FirstParagraph"/>
-      </w:pPr>
-      <w:r>
-        <w:t xml:space="preserve">Colour is interpretable, but it is not a trivial probe. Benchmarks on colour</w:t>
-      </w:r>
-      <w:r>
-        <w:t xml:space="preserve"> </w:t>
-      </w:r>
-      <w:r>
-        <w:t xml:space="preserve">understanding, compositionality, and attribute binding show that VLM behaviour can vary</w:t>
-      </w:r>
-      <w:r>
-        <w:t xml:space="preserve"> </w:t>
-      </w:r>
-      <w:r>
-        <w:t xml:space="preserve">with object category, colour distribution, visual ambiguity, and prompt form</w:t>
-      </w:r>
-      <w:r>
-        <w:t xml:space="preserve"> </w:t>
-      </w:r>
-      <w:r>
-        <w:t xml:space="preserve">[Liang2025ColorBench; Yuksekgonul2023ARO; Thrush2022Winoground]. We use car-body colour</w:t>
-      </w:r>
-      <w:r>
-        <w:t xml:space="preserve"> </w:t>
-      </w:r>
-      <w:r>
-        <w:t xml:space="preserve">as a controlled observation window rather than as a claim about general colour</w:t>
-      </w:r>
-      <w:r>
-        <w:t xml:space="preserve"> </w:t>
-      </w:r>
-      <w:r>
-        <w:t xml:space="preserve">perception.</w:t>
-      </w:r>
-    </w:p>
-    <w:bookmarkEnd w:id="22"/>
-    <w:bookmarkEnd w:id="23"/>
-    <w:bookmarkStart w:id="28" w:name="task-and-evaluation-protocol"/>
-    <w:p>
-      <w:pPr>
-        <w:pStyle w:val="Heading2"/>
-      </w:pPr>
-      <w:r>
         <w:t xml:space="preserve">3. Task and Evaluation Protocol</w:t>
       </w:r>
     </w:p>
-    <w:bookmarkStart w:id="24" w:name="task-definition"/>
+    <w:bookmarkStart w:id="21" w:name="task-definition"/>
     <w:p>
       <w:pPr>
         <w:pStyle w:val="Heading3"/>
@@ -877,8 +782,8 @@
         <w:t xml:space="preserve">keeps the interpretation tied to identical visual evidence.</w:t>
       </w:r>
     </w:p>
-    <w:bookmarkEnd w:id="24"/>
-    <w:bookmarkStart w:id="25" w:name="evaluation-set"/>
+    <w:bookmarkEnd w:id="21"/>
+    <w:bookmarkStart w:id="22" w:name="evaluation-set"/>
     <w:p>
       <w:pPr>
         <w:pStyle w:val="Heading3"/>
@@ -898,25 +803,25 @@
         <w:t xml:space="preserve"> </w:t>
       </w:r>
       <w:r>
-        <w:t xml:space="preserve">with 50 images per class. It combines 93 StanfordCars images and 207 VCoR images. Source</w:t>
-      </w:r>
-      <w:r>
-        <w:t xml:space="preserve"> </w:t>
-      </w:r>
-      <w:r>
-        <w:t xml:space="preserve">identity is retained for provenance, sanity checks, and limitations, but it is not a</w:t>
-      </w:r>
-      <w:r>
-        <w:t xml:space="preserve"> </w:t>
-      </w:r>
-      <w:r>
-        <w:t xml:space="preserve">primary experimental factor. Both sources are used as real vehicle-image inputs after</w:t>
-      </w:r>
-      <w:r>
-        <w:t xml:space="preserve"> </w:t>
-      </w:r>
-      <w:r>
-        <w:t xml:space="preserve">cropping.</w:t>
+        <w:t xml:space="preserve">with 50 images per class. It combines 93 StanfordCars images and 207 VCoR images</w:t>
+      </w:r>
+      <w:r>
+        <w:t xml:space="preserve"> </w:t>
+      </w:r>
+      <w:r>
+        <w:t xml:space="preserve">[14,15]. Source identity is retained for provenance, sanity checks, and limitations, but</w:t>
+      </w:r>
+      <w:r>
+        <w:t xml:space="preserve"> </w:t>
+      </w:r>
+      <w:r>
+        <w:t xml:space="preserve">it is not a primary experimental factor. Both sources are used as real vehicle-image</w:t>
+      </w:r>
+      <w:r>
+        <w:t xml:space="preserve"> </w:t>
+      </w:r>
+      <w:r>
+        <w:t xml:space="preserve">inputs after cropping.</w:t>
       </w:r>
     </w:p>
     <w:p>
@@ -1353,8 +1258,8 @@
         </w:tc>
       </w:tr>
     </w:tbl>
-    <w:bookmarkEnd w:id="25"/>
-    <w:bookmarkStart w:id="26" w:name="models"/>
+    <w:bookmarkEnd w:id="22"/>
+    <w:bookmarkStart w:id="23" w:name="models"/>
     <w:p>
       <w:pPr>
         <w:pStyle w:val="Heading3"/>
@@ -1368,35 +1273,29 @@
         <w:pStyle w:val="FirstParagraph"/>
       </w:pPr>
       <w:r>
-        <w:t xml:space="preserve">We evaluate LLaVA-1.5-7B, Qwen2-VL-7B-Instruct, and InternVL2-8B. These citations</w:t>
-      </w:r>
-      <w:r>
-        <w:t xml:space="preserve"> </w:t>
-      </w:r>
-      <w:r>
-        <w:t xml:space="preserve">identify the model families and reports, but they are not evidence for the robustness</w:t>
-      </w:r>
-      <w:r>
-        <w:t xml:space="preserve"> </w:t>
-      </w:r>
-      <w:r>
-        <w:t xml:space="preserve">claims in this paper [Liu2023VisualInstruction; Liu2023Improved; Wang2024Qwen2VL;</w:t>
-      </w:r>
-      <w:r>
-        <w:t xml:space="preserve"> </w:t>
-      </w:r>
-      <w:r>
-        <w:t xml:space="preserve">Chen2023InternVL; Chen2024InternVL2]. The comparison is local to these checkpoints,</w:t>
-      </w:r>
-      <w:r>
-        <w:t xml:space="preserve"> </w:t>
-      </w:r>
-      <w:r>
-        <w:t xml:space="preserve">prompts, and images.</w:t>
-      </w:r>
-    </w:p>
-    <w:bookmarkEnd w:id="26"/>
-    <w:bookmarkStart w:id="27" w:name="prompt-conditions-and-metrics"/>
+        <w:t xml:space="preserve">The evaluated checkpoints are LLaVA-1.5-7B, Qwen2-VL-7B-Instruct, and InternVL2-8B.</w:t>
+      </w:r>
+      <w:r>
+        <w:t xml:space="preserve"> </w:t>
+      </w:r>
+      <w:r>
+        <w:t xml:space="preserve">These citations identify the model families and reports, but they are not evidence for</w:t>
+      </w:r>
+      <w:r>
+        <w:t xml:space="preserve"> </w:t>
+      </w:r>
+      <w:r>
+        <w:t xml:space="preserve">the robustness claims in this paper [4,5,16-18]. The comparison is local to these</w:t>
+      </w:r>
+      <w:r>
+        <w:t xml:space="preserve"> </w:t>
+      </w:r>
+      <w:r>
+        <w:t xml:space="preserve">checkpoints, prompts, and images.</w:t>
+      </w:r>
+    </w:p>
+    <w:bookmarkEnd w:id="23"/>
+    <w:bookmarkStart w:id="24" w:name="prompt-conditions-and-metrics"/>
     <w:p>
       <w:pPr>
         <w:pStyle w:val="Heading3"/>
@@ -1766,9 +1665,9 @@
         </w:tc>
       </w:tr>
     </w:tbl>
-    <w:bookmarkEnd w:id="27"/>
-    <w:bookmarkEnd w:id="28"/>
-    <w:bookmarkStart w:id="45" w:name="results"/>
+    <w:bookmarkEnd w:id="24"/>
+    <w:bookmarkEnd w:id="25"/>
+    <w:bookmarkStart w:id="42" w:name="results"/>
     <w:p>
       <w:pPr>
         <w:pStyle w:val="Heading2"/>
@@ -1777,7 +1676,7 @@
         <w:t xml:space="preserve">4. Results</w:t>
       </w:r>
     </w:p>
-    <w:bookmarkStart w:id="29" w:name="Xd4754902de237fb40e9c75d1ba3e7b01ef36327"/>
+    <w:bookmarkStart w:id="26" w:name="Xd4754902de237fb40e9c75d1ba3e7b01ef36327"/>
     <w:p>
       <w:pPr>
         <w:pStyle w:val="Heading3"/>
@@ -2846,8 +2745,8 @@
         </w:tc>
       </w:tr>
     </w:tbl>
-    <w:bookmarkEnd w:id="29"/>
-    <w:bookmarkStart w:id="33" w:name="X559092dc33149abda0a5dac5965ed2fbbcd0b0d"/>
+    <w:bookmarkEnd w:id="26"/>
+    <w:bookmarkStart w:id="30" w:name="X559092dc33149abda0a5dac5965ed2fbbcd0b0d"/>
     <w:p>
       <w:pPr>
         <w:pStyle w:val="Heading3"/>
@@ -2917,18 +2816,18 @@
           <wp:inline>
             <wp:extent cx="3984280" cy="2793575"/>
             <wp:effectExtent b="0" l="0" r="0" t="0"/>
-            <wp:docPr descr="" title="" id="31" name="Picture"/>
+            <wp:docPr descr="" title="" id="28" name="Picture"/>
             <a:graphic>
               <a:graphicData uri="http://schemas.openxmlformats.org/drawingml/2006/picture">
                 <pic:pic>
                   <pic:nvPicPr>
-                    <pic:cNvPr descr="images/figure2_main_conflict_rates.png" id="32" name="Picture"/>
+                    <pic:cNvPr descr="images/figure2_main_conflict_rates.png" id="29" name="Picture"/>
                     <pic:cNvPicPr>
                       <a:picLocks noChangeArrowheads="1" noChangeAspect="1"/>
                     </pic:cNvPicPr>
                   </pic:nvPicPr>
                   <pic:blipFill>
-                    <a:blip r:embed="rId30"/>
+                    <a:blip r:embed="rId27"/>
                     <a:stretch>
                       <a:fillRect/>
                     </a:stretch>
@@ -2985,8 +2884,8 @@
         <w:t xml:space="preserve">labels mark counts out of 300.</w:t>
       </w:r>
     </w:p>
-    <w:bookmarkEnd w:id="33"/>
-    <w:bookmarkStart w:id="37" w:name="paired-flips-narrowed-the-attribution"/>
+    <w:bookmarkEnd w:id="30"/>
+    <w:bookmarkStart w:id="34" w:name="paired-flips-narrowed-the-attribution"/>
     <w:p>
       <w:pPr>
         <w:pStyle w:val="Heading3"/>
@@ -3062,18 +2961,18 @@
           <wp:inline>
             <wp:extent cx="4732287" cy="2978287"/>
             <wp:effectExtent b="0" l="0" r="0" t="0"/>
-            <wp:docPr descr="" title="" id="35" name="Picture"/>
+            <wp:docPr descr="" title="" id="32" name="Picture"/>
             <a:graphic>
               <a:graphicData uri="http://schemas.openxmlformats.org/drawingml/2006/picture">
                 <pic:pic>
                   <pic:nvPicPr>
-                    <pic:cNvPr descr="images/figure3_paired_flips.png" id="36" name="Picture"/>
+                    <pic:cNvPr descr="images/figure3_paired_flips.png" id="33" name="Picture"/>
                     <pic:cNvPicPr>
                       <a:picLocks noChangeArrowheads="1" noChangeAspect="1"/>
                     </pic:cNvPicPr>
                   </pic:nvPicPr>
                   <pic:blipFill>
-                    <a:blip r:embed="rId34"/>
+                    <a:blip r:embed="rId31"/>
                     <a:stretch>
                       <a:fillRect/>
                     </a:stretch>
@@ -3124,8 +3023,8 @@
         <w:t xml:space="preserve">images for which a model is faithful under C0 and false-colour-aligned under C1-C4.</w:t>
       </w:r>
     </w:p>
-    <w:bookmarkEnd w:id="37"/>
-    <w:bookmarkStart w:id="38" w:name="Xf1b91d66c6ab45192a19d2b4a082d724205f20c"/>
+    <w:bookmarkEnd w:id="34"/>
+    <w:bookmarkStart w:id="35" w:name="Xf1b91d66c6ab45192a19d2b4a082d724205f20c"/>
     <w:p>
       <w:pPr>
         <w:pStyle w:val="Heading3"/>
@@ -3198,8 +3097,8 @@
         <w:t xml:space="preserve">response space.</w:t>
       </w:r>
     </w:p>
-    <w:bookmarkEnd w:id="38"/>
-    <w:bookmarkStart w:id="42" w:name="Xb65aea865acc882181b05acea90af3c1bf3c8b9"/>
+    <w:bookmarkEnd w:id="35"/>
+    <w:bookmarkStart w:id="39" w:name="Xb65aea865acc882181b05acea90af3c1bf3c8b9"/>
     <w:p>
       <w:pPr>
         <w:pStyle w:val="Heading3"/>
@@ -3313,18 +3212,18 @@
           <wp:inline>
             <wp:extent cx="5334000" cy="3989065"/>
             <wp:effectExtent b="0" l="0" r="0" t="0"/>
-            <wp:docPr descr="" title="" id="40" name="Picture"/>
+            <wp:docPr descr="" title="" id="37" name="Picture"/>
             <a:graphic>
               <a:graphicData uri="http://schemas.openxmlformats.org/drawingml/2006/picture">
                 <pic:pic>
                   <pic:nvPicPr>
-                    <pic:cNvPr descr="images/figure4_boundary_diagnostics.png" id="41" name="Picture"/>
+                    <pic:cNvPr descr="images/figure4_boundary_diagnostics.png" id="38" name="Picture"/>
                     <pic:cNvPicPr>
                       <a:picLocks noChangeArrowheads="1" noChangeAspect="1"/>
                     </pic:cNvPicPr>
                   </pic:nvPicPr>
                   <pic:blipFill>
-                    <a:blip r:embed="rId39"/>
+                    <a:blip r:embed="rId36"/>
                     <a:stretch>
                       <a:fillRect/>
                     </a:stretch>
@@ -3387,161 +3286,161 @@
         <w:t xml:space="preserve">it.</w:t>
       </w:r>
     </w:p>
+    <w:bookmarkEnd w:id="39"/>
+    <w:bookmarkStart w:id="40" w:name="X7a3fb397faf82b760f4dc397e41ea77224a101e"/>
+    <w:p>
+      <w:pPr>
+        <w:pStyle w:val="Heading3"/>
+      </w:pPr>
+      <w:r>
+        <w:t xml:space="preserve">4.6 Validity checks reduced several alternative explanations</w:t>
+      </w:r>
+    </w:p>
+    <w:p>
+      <w:pPr>
+        <w:pStyle w:val="FirstParagraph"/>
+      </w:pPr>
+      <w:r>
+        <w:t xml:space="preserve">The parser audit reduced the risk that conflict-following counts were inflated by</w:t>
+      </w:r>
+      <w:r>
+        <w:t xml:space="preserve"> </w:t>
+      </w:r>
+      <w:r>
+        <w:t xml:space="preserve">fragile label mapping. In the primary C0-C4 experiment, all 4500 rows parsed</w:t>
+      </w:r>
+      <w:r>
+        <w:t xml:space="preserve"> </w:t>
+      </w:r>
+      <w:r>
+        <w:t xml:space="preserve">successfully and stayed within the base single-label regime. Source-stratified checks</w:t>
+      </w:r>
+      <w:r>
+        <w:t xml:space="preserve"> </w:t>
+      </w:r>
+      <w:r>
+        <w:t xml:space="preserve">reduced the concern that the main pattern was confined to one source subset. Under C0,</w:t>
+      </w:r>
+      <w:r>
+        <w:t xml:space="preserve"> </w:t>
+      </w:r>
+      <w:r>
+        <w:t xml:space="preserve">all three models were faithful in both StanfordCars and VCoR. Under C3, LLaVA</w:t>
+      </w:r>
+      <w:r>
+        <w:t xml:space="preserve"> </w:t>
+      </w:r>
+      <w:r>
+        <w:t xml:space="preserve">conflict-following appeared in both source groups, with 13/93 in StanfordCars and</w:t>
+      </w:r>
+      <w:r>
+        <w:t xml:space="preserve"> </w:t>
+      </w:r>
+      <w:r>
+        <w:t xml:space="preserve">14/207 in VCoR. This check supports source robustness as a sanity check, not as a</w:t>
+      </w:r>
+      <w:r>
+        <w:t xml:space="preserve"> </w:t>
+      </w:r>
+      <w:r>
+        <w:t xml:space="preserve">source-generalisation benchmark.</w:t>
+      </w:r>
+    </w:p>
+    <w:p>
+      <w:pPr>
+        <w:pStyle w:val="BodyText"/>
+      </w:pPr>
+      <w:r>
+        <w:t xml:space="preserve">The visual clarity audit reviewed 42 target flip rows and 42 matched faithful controls.</w:t>
+      </w:r>
+      <w:r>
+        <w:t xml:space="preserve"> </w:t>
+      </w:r>
+      <w:r>
+        <w:t xml:space="preserve">Most target rows were visually inspectable, with 38/42 clear compared with 39/42</w:t>
+      </w:r>
+      <w:r>
+        <w:t xml:space="preserve"> </w:t>
+      </w:r>
+      <w:r>
+        <w:t xml:space="preserve">controls. This weakens a global difficult-image explanation. However, visual confound</w:t>
+      </w:r>
+      <w:r>
+        <w:t xml:space="preserve"> </w:t>
+      </w:r>
+      <w:r>
+        <w:t xml:space="preserve">flags were more frequent among target rows than controls, at 11/42 versus 4/42.</w:t>
+      </w:r>
+      <w:r>
+        <w:t xml:space="preserve"> </w:t>
+      </w:r>
+      <w:r>
+        <w:t xml:space="preserve">Reflections, lighting, background colour, and multi-car interference remain plausible</w:t>
+      </w:r>
+      <w:r>
+        <w:t xml:space="preserve"> </w:t>
+      </w:r>
+      <w:r>
+        <w:t xml:space="preserve">local factors. Finally, the reproducibility audit reports that all locked experimental</w:t>
+      </w:r>
+      <w:r>
+        <w:t xml:space="preserve"> </w:t>
+      </w:r>
+      <w:r>
+        <w:t xml:space="preserve">artifacts match the snapshot, with only a non-blocking writing-facing summary</w:t>
+      </w:r>
+      <w:r>
+        <w:t xml:space="preserve"> </w:t>
+      </w:r>
+      <w:r>
+        <w:t xml:space="preserve">difference.</w:t>
+      </w:r>
+    </w:p>
+    <w:bookmarkEnd w:id="40"/>
+    <w:bookmarkStart w:id="41" w:name="X115a4772a3d2529d589de1999b3a185c1910969"/>
+    <w:p>
+      <w:pPr>
+        <w:pStyle w:val="Heading3"/>
+      </w:pPr>
+      <w:r>
+        <w:t xml:space="preserve">4.7 Multi-turn diagnostics identified a separate interaction regime</w:t>
+      </w:r>
+    </w:p>
+    <w:p>
+      <w:pPr>
+        <w:pStyle w:val="FirstParagraph"/>
+      </w:pPr>
+      <w:r>
+        <w:t xml:space="preserve">The multi-turn diagnostic tested a different interaction regime and is not part of the</w:t>
+      </w:r>
+      <w:r>
+        <w:t xml:space="preserve"> </w:t>
+      </w:r>
+      <w:r>
+        <w:t xml:space="preserve">primary single-turn evidence chain. LLaVA and Qwen remained near zero in the tested</w:t>
+      </w:r>
+      <w:r>
+        <w:t xml:space="preserve"> </w:t>
+      </w:r>
+      <w:r>
+        <w:t xml:space="preserve">multi-turn conditions, while InternVL2 rose to 21.33% in MT2 and 74.67% in MT3. This</w:t>
+      </w:r>
+      <w:r>
+        <w:t xml:space="preserve"> </w:t>
+      </w:r>
+      <w:r>
+        <w:t xml:space="preserve">shows that repeated dialogue context can create a strong model-specific vulnerability.</w:t>
+      </w:r>
+      <w:r>
+        <w:t xml:space="preserve"> </w:t>
+      </w:r>
+      <w:r>
+        <w:t xml:space="preserve">It should not be used to reinterpret the single-turn C0-C4 result.</w:t>
+      </w:r>
+    </w:p>
+    <w:bookmarkEnd w:id="41"/>
     <w:bookmarkEnd w:id="42"/>
-    <w:bookmarkStart w:id="43" w:name="X7a3fb397faf82b760f4dc397e41ea77224a101e"/>
-    <w:p>
-      <w:pPr>
-        <w:pStyle w:val="Heading3"/>
-      </w:pPr>
-      <w:r>
-        <w:t xml:space="preserve">4.6 Validity checks reduced several alternative explanations</w:t>
-      </w:r>
-    </w:p>
-    <w:p>
-      <w:pPr>
-        <w:pStyle w:val="FirstParagraph"/>
-      </w:pPr>
-      <w:r>
-        <w:t xml:space="preserve">The parser audit reduced the risk that conflict-following counts were inflated by</w:t>
-      </w:r>
-      <w:r>
-        <w:t xml:space="preserve"> </w:t>
-      </w:r>
-      <w:r>
-        <w:t xml:space="preserve">fragile label mapping. In the primary C0-C4 experiment, all 4500 rows parsed</w:t>
-      </w:r>
-      <w:r>
-        <w:t xml:space="preserve"> </w:t>
-      </w:r>
-      <w:r>
-        <w:t xml:space="preserve">successfully and stayed within the base single-label regime. Source-stratified checks</w:t>
-      </w:r>
-      <w:r>
-        <w:t xml:space="preserve"> </w:t>
-      </w:r>
-      <w:r>
-        <w:t xml:space="preserve">reduced the concern that the main pattern was confined to one source subset. Under C0,</w:t>
-      </w:r>
-      <w:r>
-        <w:t xml:space="preserve"> </w:t>
-      </w:r>
-      <w:r>
-        <w:t xml:space="preserve">all three models were faithful in both StanfordCars and VCoR. Under C3, LLaVA</w:t>
-      </w:r>
-      <w:r>
-        <w:t xml:space="preserve"> </w:t>
-      </w:r>
-      <w:r>
-        <w:t xml:space="preserve">conflict-following appeared in both source groups, with 13/93 in StanfordCars and</w:t>
-      </w:r>
-      <w:r>
-        <w:t xml:space="preserve"> </w:t>
-      </w:r>
-      <w:r>
-        <w:t xml:space="preserve">14/207 in VCoR. This check supports source robustness as a sanity check, not as a</w:t>
-      </w:r>
-      <w:r>
-        <w:t xml:space="preserve"> </w:t>
-      </w:r>
-      <w:r>
-        <w:t xml:space="preserve">source-generalisation benchmark.</w:t>
-      </w:r>
-    </w:p>
-    <w:p>
-      <w:pPr>
-        <w:pStyle w:val="BodyText"/>
-      </w:pPr>
-      <w:r>
-        <w:t xml:space="preserve">The visual clarity audit reviewed 42 target flip rows and 42 matched faithful controls.</w:t>
-      </w:r>
-      <w:r>
-        <w:t xml:space="preserve"> </w:t>
-      </w:r>
-      <w:r>
-        <w:t xml:space="preserve">Most target rows were visually inspectable, with 38/42 clear compared with 39/42</w:t>
-      </w:r>
-      <w:r>
-        <w:t xml:space="preserve"> </w:t>
-      </w:r>
-      <w:r>
-        <w:t xml:space="preserve">controls. This weakens a global difficult-image explanation. However, visual confound</w:t>
-      </w:r>
-      <w:r>
-        <w:t xml:space="preserve"> </w:t>
-      </w:r>
-      <w:r>
-        <w:t xml:space="preserve">flags were more frequent among target rows than controls, at 11/42 versus 4/42.</w:t>
-      </w:r>
-      <w:r>
-        <w:t xml:space="preserve"> </w:t>
-      </w:r>
-      <w:r>
-        <w:t xml:space="preserve">Reflections, lighting, background colour, and multi-car interference remain plausible</w:t>
-      </w:r>
-      <w:r>
-        <w:t xml:space="preserve"> </w:t>
-      </w:r>
-      <w:r>
-        <w:t xml:space="preserve">local factors. Finally, the reproducibility audit reports that all locked experimental</w:t>
-      </w:r>
-      <w:r>
-        <w:t xml:space="preserve"> </w:t>
-      </w:r>
-      <w:r>
-        <w:t xml:space="preserve">artifacts match the snapshot, with only a non-blocking writing-facing summary</w:t>
-      </w:r>
-      <w:r>
-        <w:t xml:space="preserve"> </w:t>
-      </w:r>
-      <w:r>
-        <w:t xml:space="preserve">difference.</w:t>
-      </w:r>
-    </w:p>
-    <w:bookmarkEnd w:id="43"/>
-    <w:bookmarkStart w:id="44" w:name="X115a4772a3d2529d589de1999b3a185c1910969"/>
-    <w:p>
-      <w:pPr>
-        <w:pStyle w:val="Heading3"/>
-      </w:pPr>
-      <w:r>
-        <w:t xml:space="preserve">4.7 Multi-turn diagnostics identified a separate interaction regime</w:t>
-      </w:r>
-    </w:p>
-    <w:p>
-      <w:pPr>
-        <w:pStyle w:val="FirstParagraph"/>
-      </w:pPr>
-      <w:r>
-        <w:t xml:space="preserve">The multi-turn diagnostic tested a different interaction regime and is not part of the</w:t>
-      </w:r>
-      <w:r>
-        <w:t xml:space="preserve"> </w:t>
-      </w:r>
-      <w:r>
-        <w:t xml:space="preserve">primary single-turn evidence chain. LLaVA and Qwen remained near zero in the tested</w:t>
-      </w:r>
-      <w:r>
-        <w:t xml:space="preserve"> </w:t>
-      </w:r>
-      <w:r>
-        <w:t xml:space="preserve">multi-turn conditions, while InternVL2 rose to 21.33% in MT2 and 74.67% in MT3. This</w:t>
-      </w:r>
-      <w:r>
-        <w:t xml:space="preserve"> </w:t>
-      </w:r>
-      <w:r>
-        <w:t xml:space="preserve">shows that repeated dialogue context can create a strong model-specific vulnerability.</w:t>
-      </w:r>
-      <w:r>
-        <w:t xml:space="preserve"> </w:t>
-      </w:r>
-      <w:r>
-        <w:t xml:space="preserve">It should not be used to reinterpret the single-turn C0-C4 result.</w:t>
-      </w:r>
-    </w:p>
-    <w:bookmarkEnd w:id="44"/>
-    <w:bookmarkEnd w:id="45"/>
-    <w:bookmarkStart w:id="49" w:name="discussion"/>
+    <w:bookmarkStart w:id="46" w:name="discussion"/>
     <w:p>
       <w:pPr>
         <w:pStyle w:val="Heading2"/>
@@ -3661,18 +3560,18 @@
           <wp:inline>
             <wp:extent cx="5334000" cy="2637033"/>
             <wp:effectExtent b="0" l="0" r="0" t="0"/>
-            <wp:docPr descr="" title="" id="47" name="Picture"/>
+            <wp:docPr descr="" title="" id="44" name="Picture"/>
             <a:graphic>
               <a:graphicData uri="http://schemas.openxmlformats.org/drawingml/2006/picture">
                 <pic:pic>
                   <pic:nvPicPr>
-                    <pic:cNvPr descr="images/claim_boundary_summary.png" id="48" name="Picture"/>
+                    <pic:cNvPr descr="images/claim_boundary_summary.png" id="45" name="Picture"/>
                     <pic:cNvPicPr>
                       <a:picLocks noChangeArrowheads="1" noChangeAspect="1"/>
                     </pic:cNvPicPr>
                   </pic:nvPicPr>
                   <pic:blipFill>
-                    <a:blip r:embed="rId46"/>
+                    <a:blip r:embed="rId43"/>
                     <a:stretch>
                       <a:fillRect/>
                     </a:stretch>
@@ -3761,8 +3660,8 @@
         <w:t xml:space="preserve">way to judge what the evidence supports and where it stops.</w:t>
       </w:r>
     </w:p>
-    <w:bookmarkEnd w:id="49"/>
-    <w:bookmarkStart w:id="50" w:name="limitations"/>
+    <w:bookmarkEnd w:id="46"/>
+    <w:bookmarkStart w:id="47" w:name="limitations"/>
     <w:p>
       <w:pPr>
         <w:pStyle w:val="Heading2"/>
@@ -3874,29 +3773,29 @@
         <w:pStyle w:val="BodyText"/>
       </w:pPr>
       <w:r>
-        <w:t xml:space="preserve">Finally, the bibliography is still a first-pass conference scaffold. Before submission,</w:t>
-      </w:r>
-      <w:r>
-        <w:t xml:space="preserve"> </w:t>
-      </w:r>
-      <w:r>
-        <w:t xml:space="preserve">references should be converted to the target venue style, checked for official</w:t>
-      </w:r>
-      <w:r>
-        <w:t xml:space="preserve"> </w:t>
-      </w:r>
-      <w:r>
-        <w:t xml:space="preserve">proceedings versions where available, and trimmed so that each citation supports a</w:t>
-      </w:r>
-      <w:r>
-        <w:t xml:space="preserve"> </w:t>
-      </w:r>
-      <w:r>
-        <w:t xml:space="preserve">specific local claim.</w:t>
-      </w:r>
-    </w:p>
-    <w:bookmarkEnd w:id="50"/>
-    <w:bookmarkStart w:id="51" w:name="conclusion"/>
+        <w:t xml:space="preserve">The evaluation set is also modest in size. The balanced design helps isolate paired</w:t>
+      </w:r>
+      <w:r>
+        <w:t xml:space="preserve"> </w:t>
+      </w:r>
+      <w:r>
+        <w:t xml:space="preserve">prompt effects, but it cannot estimate performance across all vehicle domains, camera</w:t>
+      </w:r>
+      <w:r>
+        <w:t xml:space="preserve"> </w:t>
+      </w:r>
+      <w:r>
+        <w:t xml:space="preserve">conditions, or colour distributions. Larger preregistered image sets would be needed to</w:t>
+      </w:r>
+      <w:r>
+        <w:t xml:space="preserve"> </w:t>
+      </w:r>
+      <w:r>
+        <w:t xml:space="preserve">turn the present behavioural pattern into a broader benchmark claim.</w:t>
+      </w:r>
+    </w:p>
+    <w:bookmarkEnd w:id="47"/>
+    <w:bookmarkStart w:id="48" w:name="conclusion"/>
     <w:p>
       <w:pPr>
         <w:pStyle w:val="Heading2"/>
@@ -3967,8 +3866,8 @@
         <w:t xml:space="preserve">settings, but the evidence does not support a general text-over-vision claim.</w:t>
       </w:r>
     </w:p>
-    <w:bookmarkEnd w:id="51"/>
-    <w:bookmarkStart w:id="52" w:name="data-availability"/>
+    <w:bookmarkEnd w:id="48"/>
+    <w:bookmarkStart w:id="49" w:name="data-availability"/>
     <w:p>
       <w:pPr>
         <w:pStyle w:val="Heading2"/>
@@ -4101,8 +4000,8 @@
         <w:t xml:space="preserve">original third-party image collections.</w:t>
       </w:r>
     </w:p>
-    <w:bookmarkEnd w:id="52"/>
-    <w:bookmarkStart w:id="53" w:name="code-availability"/>
+    <w:bookmarkEnd w:id="49"/>
+    <w:bookmarkStart w:id="50" w:name="code-availability"/>
     <w:p>
       <w:pPr>
         <w:pStyle w:val="Heading2"/>
@@ -4185,8 +4084,378 @@
         <w:t xml:space="preserve">providers.</w:t>
       </w:r>
     </w:p>
-    <w:bookmarkEnd w:id="53"/>
-    <w:bookmarkEnd w:id="54"/>
+    <w:bookmarkEnd w:id="50"/>
+    <w:bookmarkStart w:id="51" w:name="references"/>
+    <w:p>
+      <w:pPr>
+        <w:pStyle w:val="Heading2"/>
+      </w:pPr>
+      <w:r>
+        <w:t xml:space="preserve">References</w:t>
+      </w:r>
+    </w:p>
+    <w:p>
+      <w:pPr>
+        <w:pStyle w:val="FirstParagraph"/>
+      </w:pPr>
+      <w:r>
+        <w:t xml:space="preserve">[1] A. Radford et al.,</w:t>
+      </w:r>
+      <w:r>
+        <w:t xml:space="preserve"> </w:t>
+      </w:r>
+      <w:r>
+        <w:t xml:space="preserve">“Learning Transferable Visual Models From Natural Language Supervision,”</w:t>
+      </w:r>
+      <w:r>
+        <w:t xml:space="preserve"> </w:t>
+      </w:r>
+      <w:r>
+        <w:t xml:space="preserve">in Proc. ICML, 2021.</w:t>
+      </w:r>
+    </w:p>
+    <w:p>
+      <w:pPr>
+        <w:pStyle w:val="BodyText"/>
+      </w:pPr>
+      <w:r>
+        <w:t xml:space="preserve">[2] J.-B. Alayrac et al.,</w:t>
+      </w:r>
+      <w:r>
+        <w:t xml:space="preserve"> </w:t>
+      </w:r>
+      <w:r>
+        <w:t xml:space="preserve">“Flamingo: a Visual Language Model for Few-Shot Learning,”</w:t>
+      </w:r>
+      <w:r>
+        <w:t xml:space="preserve"> </w:t>
+      </w:r>
+      <w:r>
+        <w:t xml:space="preserve">arXiv:2204.14198, 2022.</w:t>
+      </w:r>
+    </w:p>
+    <w:p>
+      <w:pPr>
+        <w:pStyle w:val="BodyText"/>
+      </w:pPr>
+      <w:r>
+        <w:t xml:space="preserve">[3] J. Li, D. Li, S. Savarese, and S. Hoi,</w:t>
+      </w:r>
+      <w:r>
+        <w:t xml:space="preserve"> </w:t>
+      </w:r>
+      <w:r>
+        <w:t xml:space="preserve">“BLIP-2: Bootstrapping Language-Image Pre-training with Frozen Image Encoders and Large Language Models,”</w:t>
+      </w:r>
+      <w:r>
+        <w:t xml:space="preserve"> </w:t>
+      </w:r>
+      <w:r>
+        <w:t xml:space="preserve">in Proc. ICML, 2023.</w:t>
+      </w:r>
+    </w:p>
+    <w:p>
+      <w:pPr>
+        <w:pStyle w:val="BodyText"/>
+      </w:pPr>
+      <w:r>
+        <w:t xml:space="preserve">[4] H. Liu, C. Li, Q. Wu, and Y. J. Lee,</w:t>
+      </w:r>
+      <w:r>
+        <w:t xml:space="preserve"> </w:t>
+      </w:r>
+      <w:r>
+        <w:t xml:space="preserve">“Visual Instruction Tuning,”</w:t>
+      </w:r>
+      <w:r>
+        <w:t xml:space="preserve"> </w:t>
+      </w:r>
+      <w:r>
+        <w:t xml:space="preserve">arXiv:2304.08485, 2023.</w:t>
+      </w:r>
+    </w:p>
+    <w:p>
+      <w:pPr>
+        <w:pStyle w:val="BodyText"/>
+      </w:pPr>
+      <w:r>
+        <w:t xml:space="preserve">[5] H. Liu, C. Li, Y. Li, and Y. J. Lee,</w:t>
+      </w:r>
+      <w:r>
+        <w:t xml:space="preserve"> </w:t>
+      </w:r>
+      <w:r>
+        <w:t xml:space="preserve">“Improved Baselines with Visual Instruction Tuning,”</w:t>
+      </w:r>
+      <w:r>
+        <w:t xml:space="preserve"> </w:t>
+      </w:r>
+      <w:r>
+        <w:t xml:space="preserve">arXiv:2310.03744, 2023.</w:t>
+      </w:r>
+    </w:p>
+    <w:p>
+      <w:pPr>
+        <w:pStyle w:val="BodyText"/>
+      </w:pPr>
+      <w:r>
+        <w:t xml:space="preserve">[6] Y. Goyal, T. Khot, D. Summers-Stay, D. Batra, and D. Parikh,</w:t>
+      </w:r>
+      <w:r>
+        <w:t xml:space="preserve"> </w:t>
+      </w:r>
+      <w:r>
+        <w:t xml:space="preserve">“Making the V in VQA Matter: Elevating the Role of Image Understanding in Visual Question Answering,”</w:t>
+      </w:r>
+      <w:r>
+        <w:t xml:space="preserve"> </w:t>
+      </w:r>
+      <w:r>
+        <w:t xml:space="preserve">in Proc. CVPR, 2017.</w:t>
+      </w:r>
+    </w:p>
+    <w:p>
+      <w:pPr>
+        <w:pStyle w:val="BodyText"/>
+      </w:pPr>
+      <w:r>
+        <w:t xml:space="preserve">[7] A. Agrawal, D. Batra, D. Parikh, and A. Kembhavi,</w:t>
+      </w:r>
+      <w:r>
+        <w:t xml:space="preserve"> </w:t>
+      </w:r>
+      <w:r>
+        <w:t xml:space="preserve">“Don’t Just Assume; Look and Answer: Overcoming Priors for Visual Question Answering,”</w:t>
+      </w:r>
+      <w:r>
+        <w:t xml:space="preserve"> </w:t>
+      </w:r>
+      <w:r>
+        <w:t xml:space="preserve">in Proc. CVPR, 2018.</w:t>
+      </w:r>
+    </w:p>
+    <w:p>
+      <w:pPr>
+        <w:pStyle w:val="BodyText"/>
+      </w:pPr>
+      <w:r>
+        <w:t xml:space="preserve">[8] Y. Li, Y. Du, K. Zhou, J. Wang, W. X. Zhao, and J.-R. Wen,</w:t>
+      </w:r>
+      <w:r>
+        <w:t xml:space="preserve"> </w:t>
+      </w:r>
+      <w:r>
+        <w:t xml:space="preserve">“Evaluating Object Hallucination in Large Vision-Language Models,”</w:t>
+      </w:r>
+      <w:r>
+        <w:t xml:space="preserve"> </w:t>
+      </w:r>
+      <w:r>
+        <w:t xml:space="preserve">arXiv:2305.10355, 2023.</w:t>
+      </w:r>
+    </w:p>
+    <w:p>
+      <w:pPr>
+        <w:pStyle w:val="BodyText"/>
+      </w:pPr>
+      <w:r>
+        <w:t xml:space="preserve">[9] T. Guan et al.,</w:t>
+      </w:r>
+      <w:r>
+        <w:t xml:space="preserve"> </w:t>
+      </w:r>
+      <w:r>
+        <w:t xml:space="preserve">“HallusionBench: An Advanced Diagnostic Suite for Entangled Language Hallucination and Visual Illusion in Large Vision-Language Models,”</w:t>
+      </w:r>
+      <w:r>
+        <w:t xml:space="preserve"> </w:t>
+      </w:r>
+      <w:r>
+        <w:t xml:space="preserve">arXiv:2310.14566, 2023.</w:t>
+      </w:r>
+    </w:p>
+    <w:p>
+      <w:pPr>
+        <w:pStyle w:val="BodyText"/>
+      </w:pPr>
+      <w:r>
+        <w:t xml:space="preserve">[10] K.-i. Lee, M. Kim, S. Yoon, M. Kim, D. Lee, H. Koh, and K. Jung,</w:t>
+      </w:r>
+      <w:r>
+        <w:t xml:space="preserve"> </w:t>
+      </w:r>
+      <w:r>
+        <w:t xml:space="preserve">“VLind-Bench: Measuring Language Priors in Large Vision-Language Models,”</w:t>
+      </w:r>
+      <w:r>
+        <w:t xml:space="preserve"> </w:t>
+      </w:r>
+      <w:r>
+        <w:t xml:space="preserve">arXiv:2406.08702, 2024.</w:t>
+      </w:r>
+    </w:p>
+    <w:p>
+      <w:pPr>
+        <w:pStyle w:val="BodyText"/>
+      </w:pPr>
+      <w:r>
+        <w:t xml:space="preserve">[11] Y. Liang et al.,</w:t>
+      </w:r>
+      <w:r>
+        <w:t xml:space="preserve"> </w:t>
+      </w:r>
+      <w:r>
+        <w:t xml:space="preserve">“ColorBench: Can VLMs See and Understand the Colorful World? A Comprehensive Benchmark for Color Perception, Reasoning, and Robustness,”</w:t>
+      </w:r>
+      <w:r>
+        <w:t xml:space="preserve"> </w:t>
+      </w:r>
+      <w:r>
+        <w:t xml:space="preserve">arXiv:2504.10514, 2025.</w:t>
+      </w:r>
+    </w:p>
+    <w:p>
+      <w:pPr>
+        <w:pStyle w:val="BodyText"/>
+      </w:pPr>
+      <w:r>
+        <w:t xml:space="preserve">[12] M. Yuksekgonul, F. Bianchi, P. Kalluri, D. Jurafsky, and J. Zou,</w:t>
+      </w:r>
+      <w:r>
+        <w:t xml:space="preserve"> </w:t>
+      </w:r>
+      <w:r>
+        <w:t xml:space="preserve">“When and Why Vision-Language Models Behave Like Bags-of-Words, and What to Do About It?,”</w:t>
+      </w:r>
+      <w:r>
+        <w:t xml:space="preserve"> </w:t>
+      </w:r>
+      <w:r>
+        <w:t xml:space="preserve">in Proc. ICLR, 2023.</w:t>
+      </w:r>
+    </w:p>
+    <w:p>
+      <w:pPr>
+        <w:pStyle w:val="BodyText"/>
+      </w:pPr>
+      <w:r>
+        <w:t xml:space="preserve">[13] T. Thrush et al.,</w:t>
+      </w:r>
+      <w:r>
+        <w:t xml:space="preserve"> </w:t>
+      </w:r>
+      <w:r>
+        <w:t xml:space="preserve">“Winoground: Probing Vision and Language Models for Visio-Linguistic Compositionality,”</w:t>
+      </w:r>
+      <w:r>
+        <w:t xml:space="preserve"> </w:t>
+      </w:r>
+      <w:r>
+        <w:t xml:space="preserve">in Proc. CVPR, 2022.</w:t>
+      </w:r>
+    </w:p>
+    <w:p>
+      <w:pPr>
+        <w:pStyle w:val="BodyText"/>
+      </w:pPr>
+      <w:r>
+        <w:t xml:space="preserve">[14] J. Krause, M. Stark, J. Deng, and L. Fei-Fei,</w:t>
+      </w:r>
+      <w:r>
+        <w:t xml:space="preserve"> </w:t>
+      </w:r>
+      <w:r>
+        <w:t xml:space="preserve">“3D Object Representations for Fine-Grained Categorization,”</w:t>
+      </w:r>
+      <w:r>
+        <w:t xml:space="preserve"> </w:t>
+      </w:r>
+      <w:r>
+        <w:t xml:space="preserve">in Proc. 4th International IEEE Workshop on 3D Representation and Recognition, 2013.</w:t>
+      </w:r>
+    </w:p>
+    <w:p>
+      <w:pPr>
+        <w:pStyle w:val="BodyText"/>
+      </w:pPr>
+      <w:r>
+        <w:t xml:space="preserve">[15] K. Panetta, L. Kezebou, V. Oludare, J. Intriligator, and S. Agaian,</w:t>
+      </w:r>
+      <w:r>
+        <w:t xml:space="preserve"> </w:t>
+      </w:r>
+      <w:r>
+        <w:t xml:space="preserve">“Artificial Intelligence for Text-Based Vehicle Search, Recognition, and Continuous Localization in Traffic Videos,”</w:t>
+      </w:r>
+      <w:r>
+        <w:t xml:space="preserve"> </w:t>
+      </w:r>
+      <w:r>
+        <w:t xml:space="preserve">AI, vol. 2, no. 4, pp. 684-704, 2021.</w:t>
+      </w:r>
+    </w:p>
+    <w:p>
+      <w:pPr>
+        <w:pStyle w:val="BodyText"/>
+      </w:pPr>
+      <w:r>
+        <w:t xml:space="preserve">[16] P. Wang et al.,</w:t>
+      </w:r>
+      <w:r>
+        <w:t xml:space="preserve"> </w:t>
+      </w:r>
+      <w:r>
+        <w:t xml:space="preserve">“Qwen2-VL: Enhancing Vision-Language Model’s Perception of the World at Any Resolution,”</w:t>
+      </w:r>
+      <w:r>
+        <w:t xml:space="preserve"> </w:t>
+      </w:r>
+      <w:r>
+        <w:t xml:space="preserve">arXiv:2409.12191, 2024.</w:t>
+      </w:r>
+    </w:p>
+    <w:p>
+      <w:pPr>
+        <w:pStyle w:val="BodyText"/>
+      </w:pPr>
+      <w:r>
+        <w:t xml:space="preserve">[17] Z. Chen et al.,</w:t>
+      </w:r>
+      <w:r>
+        <w:t xml:space="preserve"> </w:t>
+      </w:r>
+      <w:r>
+        <w:t xml:space="preserve">“InternVL: Scaling up Vision Foundation Models and Aligning for Generic Visual-Linguistic Tasks,”</w:t>
+      </w:r>
+      <w:r>
+        <w:t xml:space="preserve"> </w:t>
+      </w:r>
+      <w:r>
+        <w:t xml:space="preserve">arXiv:2312.14238, 2023.</w:t>
+      </w:r>
+    </w:p>
+    <w:p>
+      <w:pPr>
+        <w:pStyle w:val="BodyText"/>
+      </w:pPr>
+      <w:r>
+        <w:t xml:space="preserve">[18] Z. Chen et al.,</w:t>
+      </w:r>
+      <w:r>
+        <w:t xml:space="preserve"> </w:t>
+      </w:r>
+      <w:r>
+        <w:t xml:space="preserve">“How Far Are We to GPT-4V? Closing the Gap to Commercial Multimodal Models with Open-Source Suites,”</w:t>
+      </w:r>
+      <w:r>
+        <w:t xml:space="preserve"> </w:t>
+      </w:r>
+      <w:r>
+        <w:t xml:space="preserve">arXiv:2404.16821, 2024.</w:t>
+      </w:r>
+    </w:p>
+    <w:bookmarkEnd w:id="51"/>
+    <w:bookmarkEnd w:id="52"/>
     <w:sectPr>
       <w:footnotePr>
         <w:numRestart w:val="eachSect"/>

</xml_diff>